<commit_message>
Ask 01 03/10/2026 07:5x: +NC-01..07 (net chung tan cuoc, hieu chuan thay, lay mau 4v4, Elo tan cuoc, engine thi quan ve hinh tan thang, tro ly AI ComfyUI noi gi cung lam, da ngon ngu 10 thu tieng) + FS-01/02 + MT-01 (tham gia AI Meeting) + PHAN R D3-01..20 => 109 ma cau, OxAlpha 69 tep; link.md moi (link raw tung tep); README tro link.md
</commit_message>
<xml_diff>
--- a/Ask 01/ASK01_TONG_HOP_2026-10-01.docx
+++ b/Ask 01/ASK01_TONG_HOP_2026-10-01.docx
@@ -17201,7 +17201,25 @@
         <w:pStyle w:val="Heading2"/>
       </w:pPr>
       <w:r>
-        <w:t>LUẬT TRẢ LỜI (áp cho MỌI phần A–Q)</w:t>
+        <w:t>PHẦN R — Đêm 02→03/10/2026: mặc định đội ĐÃ CODE + chỗ còn chưa chắc (gom từ sổ các lane đêm nay — lane `w_ask_sang_0310`, sáng 03/10/2026)</w:t>
+      </w:r>
+    </w:p>
+    <w:p>
+      <w:r>
+        <w:t>**Cách đọc phần này:** theo luật owner 02/10 13:2x («những gì Ask thì cứ code lên trước, có gì sửa sau»), các lane đêm 02→03/10 đã code luôn theo «MẶC ĐỊNH ĐÃ CHỌN» rồi mới hỏi. Mỗi câu ghi: (1) **bối cảnh** + số đo THẬT + `tệp:dòng` (đường dẫn tương đối trong kho của đội — AI ngoài không có máy của đội, số là để đọc, không phải để đo lại); (2) **đội đã chọn** — phương án đã code/đã chạy; (3) **phương án khác** đang cân; (4) **câu hỏi**; (5) **trả lời tốt** trông thế nào. **Đội chỉ sửa mặc định khi câu trả lời CHỨNG MINH đội sai** (URL tài liệu / tên tệp mã nguồn upstream / số đo kèm cấu hình). Ý không có nguồn vẫn được — ghi rõ «giả thuyết», đội sẽ dựng ca thử (A=A + đối chứng dương, ngưỡng đặt trước). **Luật trả lời cuối tệp áp cho cả Phần R** (cấm bịa; trả theo mã D3-xx).</w:t>
+      </w:r>
+    </w:p>
+    <w:p>
+      <w:r>
+        <w:t>Nhóm câu: **net / dữ liệu / train** D3-01…D3-07 · **giao thức engine** D3-08, D3-09 · **Windows / bộ nhớ** D3-10, D3-11 · **ComfyUI_Pro âm thanh / hình / đăng tải** D3-12…D3-17 · **TieuLongNu AUTO JJ象棋** D3-18 · **GPL gói Demo** D3-19 · **Meeting AI** D3-20.</w:t>
+      </w:r>
+    </w:p>
+    <w:p>
+      <w:pPr>
+        <w:pStyle w:val="Heading3"/>
+      </w:pPr>
+      <w:r>
+        <w:t>D3-01 — 8 net Fairy-Stockfish xiangqi 2022–2023 không có một dòng giấy phép: xin ai, bằng cách nào; nhãn «GPL» của AUR có đè lên CC0 của `C07E94A5` không?</w:t>
       </w:r>
     </w:p>
     <w:p>
@@ -17209,6 +17227,1404 @@
         <w:pStyle w:val="ListNumber"/>
       </w:pPr>
       <w:r>
+        <w:t>**Bối cảnh:** luật owner 02/10 18:1x: net bán được = tự train hoặc net trên mạng có giấy phép thương mại; cấm duy nhất net Pikafish official. Kiểm kê 9 nguồn (sổ `_LANE_NOTE/lock/w_net_sach_0210_2026-10-02.md` §2; văn bản giấy phép lưu ở `_LANE_NOTE/lock/w_net_sach_0210_giayphep/` kèm SHA256): net sạch DUY NHẤT nạp được vào Docco / Bodetosu / Trương Vô Kỵ là `xiangqi-c07e94a5c7cb.nnue` (11.261.932 B) — căn cứ CC0 là README `official-pikafish/Networks` (câu «the weights we train for the xiangqi variant of the Fairy-Stockfish are licensed under CC0»). 8 net cũ `83f16c17fe26 · 28d6221e2440 · bd62afd13f7c · 6f64c55fcb28 · d134cdf48baf · ae0082262b68 · c425c4166a1e · aa162e1771e5` (11,26 MB, header `0x7AF32F20/0x3C103E72` nạp được, HEAD 200 cả 8, Elo trên trang +541…+889) KHÔNG có giấy phép: câu CC0 của trang `fairy-stockfish.github.io/nnue` chỉ áp «networks with a date in 2026 or later»; 10 issue `license` của Fairy-Stockfish không cái nào nói về net. Thêm 2 net 11 MB `4507919dc833…` / `f1ad9ec65699…` và 3 net 22 MB `xiangqi-xy.nnue` (arch `0x3C102EF2`) không rõ nguồn. Gói AUR `fairy-stockfish-xiangqi-nnue` ghi `license=('GPL-3.0-or-later')` cho chính tệp `C07E94A5`.</w:t>
+      </w:r>
+    </w:p>
+    <w:p>
+      <w:pPr>
+        <w:pStyle w:val="ListNumber"/>
+      </w:pPr>
+      <w:r>
+        <w:t>**Đội đã chọn:** 8 + 5 net trên = CHƯA SẠCH ⇒ chỉ đo A/B nội bộ, không ship; coi nhãn GPL của AUR là nhãn của người đóng gói, không phải giấy phép của net; đường có net bán được mạnh hơn = train tiếp từ `C07E94A5` hoặc từ đầu (TU_DAU).</w:t>
+      </w:r>
+    </w:p>
+    <w:p>
+      <w:pPr>
+        <w:pStyle w:val="ListNumber"/>
+      </w:pPr>
+      <w:r>
+        <w:t>**Phương án khác:** (a) xin văn bản giấy phép từ từng tác giả (ianfab / Fabian Fichter, Belzedar, 竹影听溪, Vincentzyx) qua GitHub issue hoặc Discord Fairy-Stockfish — việc gửi tin là của owner; (b) lập luận «trọng số máy sinh không có bản quyền» — đội KHÔNG dựa vào nếu không có nguồn pháp lý.</w:t>
+      </w:r>
+    </w:p>
+    <w:p>
+      <w:pPr>
+        <w:pStyle w:val="ListNumber"/>
+      </w:pPr>
+      <w:r>
+        <w:t>**Câu hỏi:** (i) Có văn bản công khai nào (commit, issue, README cũ, tin Discord được trích lại) gán giấy phép cho các net xiangqi trước 2026 trên trang Fairy-Stockfish NNUE không? (ii) Trường `license=` trong PKGBUILD AUR có giá trị gì với tệp dữ liệu do người khác train? (iii) Nếu xin phép tác giả, văn bản tối thiểu cần có gì (CC0 / MIT cho tệp trọng số, tên tệp + SHA256) để làm hồ sơ nguồn gốc?</w:t>
+      </w:r>
+    </w:p>
+    <w:p>
+      <w:pPr>
+        <w:pStyle w:val="ListNumber"/>
+      </w:pPr>
+      <w:r>
+        <w:t>**Trả lời tốt:** URL cụ thể (commit / issue / thread) + một câu trích nguyên văn; hoặc «không tìm thấy» + nơi nên hỏi. Không đoán tên người giữ quyền.</w:t>
+      </w:r>
+    </w:p>
+    <w:p>
+      <w:pPr>
+        <w:pStyle w:val="Heading3"/>
+      </w:pPr>
+      <w:r>
+        <w:t>D3-02 — `data.db` 180,8 triệu dòng điểm KHÔNG có cột nguồn: có cách nào nhận ra công cụ / engine / độ sâu đã sinh điểm không?</w:t>
+      </w:r>
+    </w:p>
+    <w:p>
+      <w:pPr>
+        <w:pStyle w:val="ListNumber"/>
+      </w:pPr>
+      <w:r>
+        <w:t>**Bối cảnh:** schema `score(vkey INT64, vmove INT, score INT, atime INT64, vscore INT, vvalid INT, PRIMARY KEY(vkey,vmove)) WITHOUT ROWID` + `mirror(k1,k2,flag)` (kiểm kê chỉ đọc 02/10, `_LANE_NOTE/_scratch_code_luu/w_ncb_0210/kiem_ke_20261002_1921.json`; sổ `_LANE_NOTE/lock/w_ncb_0210_2026-10-02.md` §3). Số đo toàn bảng: 180.813.410 dòng / 107.121.412 thế (52,5 M thế 1 nước, tối đa 82 nước/thế); `score` từ −32000 tới 32000, 107,2 M dòng trong [−50; 50], 3,51 M dòng ≤ −30000, 3,33 M ≥ 30000; `vscore` NULL ở 180.811.977 dòng; `vvalid = 0` ở 27,4 M dòng; `atime = 0` ở 112,5 M dòng, còn lại là dấu giờ dạng `YYYYMMDDhhmmss` từ 20201115073501 tới 20221120222131; mã nước trộn 2 «phương ngữ» (16×16 và native, `SourceCode/BookTool_Xiangqi/A5VmoveDialectSelfTest.cs:6-9`), giải mã duy nhất 99,79 %. Luật owner 26/09: điểm data.db KHÔNG làm nhãn train vì không truy được nguồn (không lập được hồ sơ giấy phép).</w:t>
+      </w:r>
+    </w:p>
+    <w:p>
+      <w:pPr>
+        <w:pStyle w:val="ListNumber"/>
+      </w:pPr>
+      <w:r>
+        <w:t>**Đội đã chọn:** bộ nạp `SourceCode/Shared/DataFen/nap_data_db.py` chỉ xuất THẾ + nước tốt, gắn nhãn `KHONG_BAN`, không xuất cột điểm; điểm train do thầy CC0 chấm lại (D3-04).</w:t>
+      </w:r>
+    </w:p>
+    <w:p>
+      <w:pPr>
+        <w:pStyle w:val="ListNumber"/>
+      </w:pPr>
+      <w:r>
+        <w:t>**Phương án khác:** (a) «vân tay engine»: chấm lại một mẫu thế bằng các engine nghi ngờ ở nhiều độ sâu rồi so phân bố điểm; (b) nhận dạng theo khuôn: bộ cột `vscore/vvalid/atime` + sentinel ±32000 giống khuôn sách của GUI / kho nào (BHGui `.obk` có bảng `bhobk(vkey,vmove,vscore,vwin,vdraw,vlost,vvalid,vmemo,vindex)`, chessdb.cn, …).</w:t>
+      </w:r>
+    </w:p>
+    <w:p>
+      <w:pPr>
+        <w:pStyle w:val="ListNumber"/>
+      </w:pPr>
+      <w:r>
+        <w:t>**Câu hỏi:** (i) Khuôn `score(vkey, vmove, score, atime)` với dấu giờ `YYYYMMDDhhmmss` và mate ±32000 là định dạng xuất của công cụ / kho nào phổ biến trong cộng đồng cờ tướng (BHGui, 兵河, 象棋旋风, chessdb.cn dump…)? (ii) Phương án (a) có tiền lệ / tài liệu nào đủ tin để làm HỒ SƠ NGUỒN (không chỉ đoán), hay về nguyên tắc không chứng minh được?</w:t>
+      </w:r>
+    </w:p>
+    <w:p>
+      <w:pPr>
+        <w:pStyle w:val="ListNumber"/>
+      </w:pPr>
+      <w:r>
+        <w:t>**Trả lời tốt:** tên công cụ + tài liệu định dạng có URL; hoặc «không nhận ra» — đừng đoán tên engine.</w:t>
+      </w:r>
+    </w:p>
+    <w:p>
+      <w:pPr>
+        <w:pStyle w:val="Heading3"/>
+      </w:pPr>
+      <w:r>
+        <w:t>D3-03 — Nhãn CHÍNH SÁCH từ nhiều nước có điểm của cùng một thế: argmax hay phân bố mềm, khi ~85 % thế có biên top1−top2 &lt; 50 cp?</w:t>
+      </w:r>
+    </w:p>
+    <w:p>
+      <w:pPr>
+        <w:pStyle w:val="ListNumber"/>
+      </w:pPr>
+      <w:r>
+        <w:t>**Bối cảnh:** mẫu 59.971 thế của data.db (cùng tệp kiểm kê D3-02): thế có ≥ 2 nước — biên top1−top2 = 0 ở 434 · 1–49 cp ở 5.824 · 50–199 ở 865 · ≥ 200 ở 226 thế. Phiếu `AI_Debate/onGoing/DEBATE_NET_CO_BAN_DATA_DB_2026-10-02.md:30` còn 3 câu chưa chắc: dùng nhiều nước có điểm làm nhãn chính sách thế nào; cỡ lô mồi tối thiểu (xem D3-04); chuẩn hoá thang `score` của sách (cp? mate?) sang thang trainer.</w:t>
+      </w:r>
+    </w:p>
+    <w:p>
+      <w:pPr>
+        <w:pStyle w:val="ListNumber"/>
+      </w:pPr>
+      <w:r>
+        <w:t>**Đội đã chọn** (`nap_data_db.py`, sổ `w_ncb_0210` §1): `nuoc_tot` = argmax `score` trên các nước giải mã DUY NHẤT và `vvalid != 0`; điểm mate (|score| ≥ 20000) VẪN tính khi chọn argmax; `vvalid` NULL = hợp lệ; hoà điểm ⇒ nước UCI nhỏ hơn (tất định). Nhãn này hiện CHƯA vào trainer nào (NNUE Fairy / Pikafish chỉ học value).</w:t>
+      </w:r>
+    </w:p>
+    <w:p>
+      <w:pPr>
+        <w:pStyle w:val="ListNumber"/>
+      </w:pPr>
+      <w:r>
+        <w:t>**Phương án khác:** (a) phân bố mềm softmax(score / T) trên mọi nước có điểm; (b) chỉ nhận thế có biên ≥ 50 cp; (c) bỏ hẳn nhãn chính sách, data.db chỉ là nguồn FEN.</w:t>
+      </w:r>
+    </w:p>
+    <w:p>
+      <w:pPr>
+        <w:pStyle w:val="ListNumber"/>
+      </w:pPr>
+      <w:r>
+        <w:t>**Câu hỏi:** với mục tiêu NNUE value (kiểu Fairy-Stockfish / Pikafish), có thể thêm đầu policy nhỏ để xếp nước — nhãn policy từ điểm nhiều nước có ích không; nếu có thì (a), (b) hay argmax, T bao nhiêu? Thang `score` của sách (cp kiểu Pikafish? mate = ±32000 − ply?) quy đổi sang thang trainer thế nào (liên quan O-05, T36-03)?</w:t>
+      </w:r>
+    </w:p>
+    <w:p>
+      <w:pPr>
+        <w:pStyle w:val="ListNumber"/>
+      </w:pPr>
+      <w:r>
+        <w:t>**Trả lời tốt:** tiền lệ có URL (Lc0 policy target, KataGo, «policy distillation» cho engine alpha-beta); con số T / ngưỡng kèm lý do; «không có ích cho NNUE value-only» cũng là câu trả lời.</w:t>
+      </w:r>
+    </w:p>
+    <w:p>
+      <w:pPr>
+        <w:pStyle w:val="Heading3"/>
+      </w:pPr>
+      <w:r>
+        <w:t>D3-04 — Lô mồi «net cơ bản» TU_DAU cho Trương Vô Kỵ: thầy Docco 100k nodes, TT nối giữa các thế, tàn cuộc 0,3 — cỡ lô tối thiểu bao nhiêu thì A/B mới có nghĩa?</w:t>
+      </w:r>
+    </w:p>
+    <w:p>
+      <w:pPr>
+        <w:pStyle w:val="ListNumber"/>
+      </w:pPr>
+      <w:r>
+        <w:t>**Bối cảnh:** job `SourceCode/Shared/DataFen/ncb03_job.py` (sổ `_LANE_NOTE/lock/w_ncb3_0210_2026-10-02.md` §2–§6): thế từ data.db → thầy Docco (net CC0 `C07E94A5`, Threads 1, Hash 64, NoBook, readback NNUE) chấm → trộn tàn cuộc `--bac 1` → train từ net khởi tạo ngẫu nhiên trên CPU (khuôn trainer Docco) → readback net ra trong engine TVK. Dry-run 200 thế (03/10 04:3x): thầy 5.000 nodes = 0,0295 s/thế; nodes ×4 ⇒ điểm đổi ở 191/200 thế, nước đổi 95/200, lệch TB 39,5 cp; 30 bước × 256 mẫu: loss đo độc lập train 0,014917 → 0,014551, val 0,016166 → 0,016151; net ra readback đúng SHA, NNUE. Lô thật ~10.300 thế ở 100k nodes (ngoại suy ~0,26 s/thế ≈ 0,74 CPU-giờ) đang chạy.</w:t>
+      </w:r>
+    </w:p>
+    <w:p>
+      <w:pPr>
+        <w:pStyle w:val="ListNumber"/>
+      </w:pPr>
+      <w:r>
+        <w:t>**Đội đã chọn:** thầy Docco **100.000 nodes**; bỏ nhãn |cp| &gt; 10000 (mate) khỏi lô train; tàn cuộc tỉ lệ 0,3; tắt vòng val 1.000.000 mẫu của trainer (đo loss độc lập thay thế); chia mảnh 250 thế/tiến trình và **TT của engine NỐI giữa các thế trong một mảnh** (nhãn phụ thuộc cách chia — ghi `the_moi_manh` vào KET_QUA).</w:t>
+      </w:r>
+    </w:p>
+    <w:p>
+      <w:pPr>
+        <w:pStyle w:val="ListNumber"/>
+      </w:pPr>
+      <w:r>
+        <w:t>**Phương án khác:** (a) `ucinewgame` / xoá TT trước MỖI thế (nhãn độc lập cách chia, chậm hơn); (b) thầy theo depth cố định thay vì nodes; (c) giữ nhãn mate dưới dạng điểm kẹp thay vì bỏ.</w:t>
+      </w:r>
+    </w:p>
+    <w:p>
+      <w:pPr>
+        <w:pStyle w:val="ListNumber"/>
+      </w:pPr>
+      <w:r>
+        <w:t>**Câu hỏi:** (i) Trong datagen chuẩn (Stockfish `gensfen` / tools, Pikafish, `variant-nnue-tools` của Fairy) TT có được xoá giữa các thế không, có ảnh hưởng đo được tới chất lượng nhãn? (ii) Net khuôn Fairy xiangqi ~11 MB train TỪ ĐẦU cần tối thiểu bao nhiêu thế có nhãn (bậc 10⁵? 10⁷? 10⁹?) trước khi A/B với net khởi tạo cho khác biệt có nghĩa — có số công bố? (iii) 100k nodes cho thầy có hợp lý so với thực hành gensfen (depth hay nodes bao nhiêu)?</w:t>
+      </w:r>
+    </w:p>
+    <w:p>
+      <w:pPr>
+        <w:pStyle w:val="ListNumber"/>
+      </w:pPr>
+      <w:r>
+        <w:t>**Trả lời tốt:** số có nguồn (fishtest / nnue-pytorch wiki / tài liệu Pikafish, Fairy) + cấu hình; hoặc thiết kế ca thử (A=A + dương, ngưỡng đặt trước).</w:t>
+      </w:r>
+    </w:p>
+    <w:p>
+      <w:pPr>
+        <w:pStyle w:val="Heading3"/>
+      </w:pPr>
+      <w:r>
+        <w:t>D3-05 — A/B net với engine TẤT ĐỊNH (Threads 1 + nodes cố định): A=A thành phép thử đối xứng, 10 thế xuất phát ⇒ ván lặp lại y hệt; với n nhỏ nên đo thế nào?</w:t>
+      </w:r>
+    </w:p>
+    <w:p>
+      <w:pPr>
+        <w:pStyle w:val="ListNumber"/>
+      </w:pPr>
+      <w:r>
+        <w:t>**Bối cảnh:** rig `_LANE_NOTE/_scratch_code_luu/w_net_ab_0210/ab_net.py` gọi BookTool `AbNgan` (`SourceCode/BookTool_Xiangqi/AbNgan.cs:282-313`: nodes cố định, Ponder tắt, NoBook, luật 80 ply, A=A + đối chứng DƯƠNG nodes ×4). Lô mồi 02/10 (nodes 50.000, Threads 1, Hash 64): Docco A=A +4 =4 −4 / 12 ⇒ Elo 0 [−108; +108], dương +12 =4 −0 / 16 ⇒ +338 [+176; +∞]; Bodetosu A=A 0 [−108; +108], dương +255 [+96; +807]; TVK y hệt Docco. Phát hiện (sổ `_LANE_NOTE/lock/w_net_ab_0210_2026-10-02.md` §5): Threads 1 + nodes cố định là TẤT ĐỊNH ⇒ hai ván cùng thế đảo màu đánh lại đúng chuỗi nước (độ dài 90/90, 117/117…); `AbNgan` lấy thế `(g/2) % N` từ `EngineMatch.BalancedOpenings()` = **10 thế** (`SourceCode/BookTool_Xiangqi/EngineMatch.cs:811-842`) và bản CLI không đọc bộ thế ⇒ `soVan &gt; 20` nhân đôi n giả, KTC95 hẹp giả.</w:t>
+      </w:r>
+    </w:p>
+    <w:p>
+      <w:pPr>
+        <w:pStyle w:val="ListNumber"/>
+      </w:pPr>
+      <w:r>
+        <w:t>**Đội đã chọn:** nodes 50.000 (NPS đo 241k–690k; 100k ⇒ ~2 phút/ván, quá dài cho «test ngắn» luật 18/09); trần số ván = 2 × số thế; ván trùng hệt ⇒ rc 6; vá BookTool đọc bộ thế `SourceCode/Shared/LuatCo/bo_the_khaicuoc_binhthuong.txt` (35 thế ⇒ tới ~70 ván không lặp); KTC95 + SPRT hai phía dừng sớm trên lô 20 ván; chọn net khi cận dưới KTC95 &gt; 0.</w:t>
+      </w:r>
+    </w:p>
+    <w:p>
+      <w:pPr>
+        <w:pStyle w:val="ListNumber"/>
+      </w:pPr>
+      <w:r>
+        <w:t>**Phương án khác:** (a) phá tất định: nodes ± ngẫu nhiên nhỏ mỗi nước, hoặc Threads 2; (b) bộ thế lớn (hàng nghìn thế cân bằng, kiểu UHO của cờ vua) — phải có nguồn KHÔNG từ book (luật NoBook); (c) thống kê pentanomial theo cặp ván.</w:t>
+      </w:r>
+    </w:p>
+    <w:p>
+      <w:pPr>
+        <w:pStyle w:val="ListNumber"/>
+      </w:pPr>
+      <w:r>
+        <w:t>**Câu hỏi:** (i) Với engine tất định, A=A còn chứng minh được gì, nên thay bằng đối chứng nào? (ii) Công thức thống kê đúng cho cặp ván cùng thế đảo màu (pentanomial — công thức KTC / SPRT theo fishtest) khi n chỉ 20–70 ván? (iii) Có bộ thế khởi đầu cân bằng cho cờ tướng công khai, giấy phép rõ, như UHO / 8moves của cờ vua không?</w:t>
+      </w:r>
+    </w:p>
+    <w:p>
+      <w:pPr>
+        <w:pStyle w:val="ListNumber"/>
+      </w:pPr>
+      <w:r>
+        <w:t>**Trả lời tốt:** công thức + URL (fishtest wiki, cutechess `-repeat`, bài pentanomial SPRT); tên bộ thế + giấy phép + cách sinh.</w:t>
+      </w:r>
+    </w:p>
+    <w:p>
+      <w:pPr>
+        <w:pStyle w:val="Heading3"/>
+      </w:pPr>
+      <w:r>
+        <w:t>D3-06 — Dữ liệu train xuất từ ván Engine Fight: `.plain` hay binpack; điểm search ngay trong ván có dùng làm nhãn được không?</w:t>
+      </w:r>
+    </w:p>
+    <w:p>
+      <w:pPr>
+        <w:pStyle w:val="ListNumber"/>
+      </w:pPr>
+      <w:r>
+        <w:t>**Bối cảnh:** T-28 `SourceCode/Shared/EngineFight/EngineFightGopRaNet.cs` (sổ `_LANE_NOTE/lock/w_t28_ef_0210_2026-10-02.md` §0 mục 7): `van.jsonl` ⇒ `.plain` (fen / move / score / ply / result; điểm theo bên đi), CHỈ ván NoBook, bỏ ván hỏng / 0 nước, bỏ nước không điểm và |điểm| ≥ 29000, khử trùng theo FEN chuẩn hoá, ván có «Thầy» xếp trước; 0 thế ⇒ rc 2. Trainer của đội: Docco (fork `variant-nnue-pytorch`), OngThan (`pikafish-nnue-pytorch`), Bodetosu (`train_nnue_gpu_v3.py` tự viết), TVK theo khuôn Docco. Lane ghi «chưa chắc (Q-a)»: trainer từng engine đọc đuôi nào.</w:t>
+      </w:r>
+    </w:p>
+    <w:p>
+      <w:pPr>
+        <w:pStyle w:val="ListNumber"/>
+      </w:pPr>
+      <w:r>
+        <w:t>**Đội đã chọn:** xuất `.plain` chuẩn, chuyển định dạng là việc của trainer; điểm lấy NGUYÊN từ search trong ván (theo đồng hồ / nodes của giải).</w:t>
+      </w:r>
+    </w:p>
+    <w:p>
+      <w:pPr>
+        <w:pStyle w:val="ListNumber"/>
+      </w:pPr>
+      <w:r>
+        <w:t>**Phương án khác:** (a) xuất thẳng `.bin` / `.binpack` (khuôn nào cho bàn 90 ô?); (b) chỉ lấy FEN từ ván rồi cho thầy chấm lại ở nodes cố định (như D3-04) để đồng nhất thang điểm.</w:t>
+      </w:r>
+    </w:p>
+    <w:p>
+      <w:pPr>
+        <w:pStyle w:val="ListNumber"/>
+      </w:pPr>
+      <w:r>
+        <w:t>**Câu hỏi:** (i) `variant-nnue-pytorch` và `pikafish-nnue-pytorch` đọc trực tiếp định dạng nào cho xiangqi (plain / bin / binpack), có công cụ chuyển / rescore chính thức nào? (ii) Điểm search trong ván đấu (độ sâu thay đổi theo đồng hồ) làm nhãn có hại không — thực hành của Stockfish / Pikafish với dữ liệu «điểm trong ván» thế nào? (liên quan T34-01)</w:t>
+      </w:r>
+    </w:p>
+    <w:p>
+      <w:pPr>
+        <w:pStyle w:val="ListNumber"/>
+      </w:pPr>
+      <w:r>
+        <w:t>**Trả lời tốt:** tên tệp / hàm loader trong repo upstream + URL; tên tool chuyển định dạng nếu có.</w:t>
+      </w:r>
+    </w:p>
+    <w:p>
+      <w:pPr>
+        <w:pStyle w:val="Heading3"/>
+      </w:pPr>
+      <w:r>
+        <w:t>D3-07 — Dùng px0data (ODbL) chỉ NỘI BỘ để train net: net ra là «Produced Work» hay «Derivative Database», còn bán được không?</w:t>
+      </w:r>
+    </w:p>
+    <w:p>
+      <w:pPr>
+        <w:pStyle w:val="ListNumber"/>
+      </w:pPr>
+      <w:r>
+        <w:t>**Bối cảnh:** px0data (dữ liệu Pika Xiangqi Zero, ~10,3 GB đã có trên máy) được README / Kaggle khai theo **ODbL**; đội đã sửa ví dụ sai `--giay-phep CC0` ở `SourceCode/Shared/LuatCo/xoa_sau_nap.py:45` (sổ `_LANE_NOTE/lock/w_t13_vua_0210_2026-10-02.md` §1e). Luật owner 20/09 15:1x mục 3: không trộn dump Pika Zero (ODbL) vào dữ liệu cho net bán. Nửa sau việc CT-B3-04 (bộ đổi chunk px0data → FEN cho dùng nội bộ) đang chờ owner quyết.</w:t>
+      </w:r>
+    </w:p>
+    <w:p>
+      <w:pPr>
+        <w:pStyle w:val="ListNumber"/>
+      </w:pPr>
+      <w:r>
+        <w:t>**Đội đã chọn:** CHƯA làm bộ đổi px0data → FEN; cổng đóng gói sẽ ĐỎ nếu net train từ px0data bị gắn cờ bán.</w:t>
+      </w:r>
+    </w:p>
+    <w:p>
+      <w:pPr>
+        <w:pStyle w:val="ListNumber"/>
+      </w:pPr>
+      <w:r>
+        <w:t>**Phương án khác:** (a) px0data chỉ để đo / đánh giá, không train; (b) train net NỘI BỘ (không ship) từ px0data; (c) chỉ dùng kết quả ván (thắng/hoà/thua), không dùng nhãn của px0.</w:t>
+      </w:r>
+    </w:p>
+    <w:p>
+      <w:pPr>
+        <w:pStyle w:val="ListNumber"/>
+      </w:pPr>
+      <w:r>
+        <w:t>**Câu hỏi:** theo văn bản ODbL 1.0 (các điều về «Produced Work», «Derivative Database», share-alike và ghi chú nguồn), trọng số mạng nơ-ron train từ cơ sở dữ liệu ODbL thuộc loại nào? Có ý kiến chính thức của Open Data Commons / OSMF (OpenStreetMap + máy học) hay án lệ nào không? Nếu là Produced Work thì ghi chú tối thiểu khi phân phối là gì?</w:t>
+      </w:r>
+    </w:p>
+    <w:p>
+      <w:pPr>
+        <w:pStyle w:val="ListNumber"/>
+      </w:pPr>
+      <w:r>
+        <w:t>**Trả lời tốt:** trích điều khoản ODbL kèm số mục + URL opendatacommons.org; ý kiến chính thức nếu có; «không có án lệ» + mức rủi ro ước lượng.</w:t>
+      </w:r>
+    </w:p>
+    <w:p>
+      <w:pPr>
+        <w:pStyle w:val="Heading3"/>
+      </w:pPr>
+      <w:r>
+        <w:t>D3-08 — `setoption` khi search đang chạy (kể cả `go infinite` / `go ponder`): dừng + join rồi ghi, chờ search tự xong, hay từ chối?</w:t>
+      </w:r>
+    </w:p>
+    <w:p>
+      <w:pPr>
+        <w:pStyle w:val="ListNumber"/>
+      </w:pPr>
+      <w:r>
+        <w:t>**Bối cảnh:** Nữ Oa `SourceCode/Engine_Xiangqi/engine-project/OngThan/src/ucci.cpp:203` (bản trước vá, `ef6d4951`) ghi `gConfig` TRƯỚC mọi bước dừng trong khi searchThread đọc các ô đó ở mỗi nút (`board.cpp:36`, `search.cpp:251,432,434,533,536,621,631`, `search_smp.h:234-236`); chuỗi &gt; 15 ký tự (MSVC SSO) nằm trên heap ⇒ gán lại giữa lúc đọc = đọc vùng đã giải phóng; `gBook.close()` (`sqlite3_close`) chạy khi search đang `probe()`. Bodetosu đã `stopAndJoin()` trước `gConfig.setOption` từ 13/09 (`SourceCode/OngThan_variants/Bodetosu/src/ucci.cpp:348`) nhưng còn 4 nhánh đứng trước dòng đó (`ProfileNodes`, `NganDem`, `Rule`/`EvalBlend` giá trị rác, lệnh `conthist`) ghi trạng thái mà search đọc. GUI của đội (TieuLongNu) có gửi setoption giữa `go infinite`.</w:t>
+      </w:r>
+    </w:p>
+    <w:p>
+      <w:pPr>
+        <w:pStyle w:val="ListNumber"/>
+      </w:pPr>
+      <w:r>
+        <w:t>**Đội đã chọn** (sổ `_LANE_NOTE/lock/w_nuoa_e12_0210_2026-10-02.md` §2 mục 5–7, `_LANE_NOTE/lock/w_bodetosu_e12_0210_2026-10-02.md` §2): MỌI setoption (kể cả option lạ): search còn sống ⇒ in `info string setoption &lt;tên&gt;: search con song -&gt; dung …`, `stopAndJoin()` (search nhả `bestmove` ngay) rồi mới ghi; search đã tự xong ⇒ chỉ join, không in. GUI muốn phân tích tiếp phải `go` lại.</w:t>
+      </w:r>
+    </w:p>
+    <w:p>
+      <w:pPr>
+        <w:pStyle w:val="ListNumber"/>
+      </w:pPr>
+      <w:r>
+        <w:t>**Phương án khác:** (a) CHỜ search tự xong rồi ghi (với `go infinite` sẽ treo tới khi có `stop`); (b) xếp hàng setoption, áp ở lần `go` sau; (c) chụp cấu hình riêng cho từng lượt search (phải sửa ≥ 23 chỗ đọc `gConfig.*`).</w:t>
+      </w:r>
+    </w:p>
+    <w:p>
+      <w:pPr>
+        <w:pStyle w:val="ListNumber"/>
+      </w:pPr>
+      <w:r>
+        <w:t>**Câu hỏi:** đặc tả UCI (bản Stefan Meyer-Kahlen) và UCCI nói gì về `setoption` khi engine đang tính — «chỉ gửi khi engine đang chờ» là nghĩa vụ của GUI hay engine phải tự xử lý? Stockfish / Pikafish hiện xử lý thế nào (tên hàm trong `uci.cpp` / `engine.cpp`)? Dừng-và-nhả-`bestmove` có làm GUI phổ biến (Arena, cutechess-cli, BHGui, SharkChess) hiểu nhầm thành nước đi thật không?</w:t>
+      </w:r>
+    </w:p>
+    <w:p>
+      <w:pPr>
+        <w:pStyle w:val="ListNumber"/>
+      </w:pPr>
+      <w:r>
+        <w:t>**Trả lời tốt:** trích đặc tả + tên hàm / dòng upstream có URL commit; hành vi GUI có nguồn.</w:t>
+      </w:r>
+    </w:p>
+    <w:p>
+      <w:pPr>
+        <w:pStyle w:val="Heading3"/>
+      </w:pPr>
+      <w:r>
+        <w:t>D3-09 — Hai hành vi biên của engine: Hash không phải luỹ thừa 2, và `go mate N` bị `stop` trước khi tìm thấy chiếu bí</w:t>
+      </w:r>
+    </w:p>
+    <w:p>
+      <w:pPr>
+        <w:pStyle w:val="ListNumber"/>
+      </w:pPr>
+      <w:r>
+        <w:t>**Bối cảnh:** Nữ Oa `tt.h:164-165` (trước vá) làm tròn LÊN luỹ thừa 2 ⇒ `Hash 3000` thành 4096 MB (đúng đại lượng commit làm máy đội sập 02/10 14:15), `new TTBucket[n]()` không `nothrow` ⇒ thiếu bộ nhớ là chết engine. Bodetosu `go mate N` chạy DFS đồng bộ ngay trên luồng đọc stdin (`SourceCode/OngThan_variants/Bodetosu/src/ucci.cpp:656-684` trước vá) ⇒ thế `3akab2/9/4b4/9/9/9/9/2N1C4/4R4/2BK5 w - - 0 1` với `go mate 30` chưa xong sau 60 s và `stop` không được đọc (sổ `_LANE_NOTE/lock/w_engine_cao_0210_2026-10-02.md` §1, §4.2).</w:t>
+      </w:r>
+    </w:p>
+    <w:p>
+      <w:pPr>
+        <w:pStyle w:val="ListNumber"/>
+      </w:pPr>
+      <w:r>
+        <w:t>**Đội đã chọn** (đã build + deploy): Hash làm tròn XUỐNG luỹ thừa 2 ≤ yêu cầu (giữ `hash &amp; mask` ⇒ bench bit-exact), cấp phát `nothrow` lùi từng nấc ½, readback `info string Hash: yeu cau X MB -&gt; TT that Y MB`; `go mate` chạy trong searchThread, kiểm cờ dừng mỗi nút — bị dừng ⇒ `info string go mate: dung truoc khi tim thay chieu bi` + `bestmove` = nước hợp lệ ĐẦU TIÊN (không bao giờ báo mate giả); không có mate ⇒ `info string no forced mate` + search thường. Đo sau vá: `stop` → `bestmove` 1 ms.</w:t>
+      </w:r>
+    </w:p>
+    <w:p>
+      <w:pPr>
+        <w:pStyle w:val="ListNumber"/>
+      </w:pPr>
+      <w:r>
+        <w:t>**Phương án khác:** Hash đúng X MB bằng chỉ số nhân-dịch (`mul_hi64(key, số cụm)`) — đổi chỉ số TT ⇒ bench đổi; `go mate` bị dừng ⇒ trả nước tốt nhất của một search ngắn thay vì nước hợp lệ đầu tiên.</w:t>
+      </w:r>
+    </w:p>
+    <w:p>
+      <w:pPr>
+        <w:pStyle w:val="ListNumber"/>
+      </w:pPr>
+      <w:r>
+        <w:t>**Câu hỏi:** (i) Stockfish / Pikafish / Fairy xử lý Hash không phải luỹ thừa 2 thế nào, có báo lại kích thước thật không; cấp phát Hash hỏng thì nên báo gì cho GUI? (ii) Đặc tả UCI / UCCI quy định gì về `bestmove` sau `stop` của `go mate N` khi chưa có kết quả — trả nước nào là chuẩn ngành?</w:t>
+      </w:r>
+    </w:p>
+    <w:p>
+      <w:pPr>
+        <w:pStyle w:val="ListNumber"/>
+      </w:pPr>
+      <w:r>
+        <w:t>**Trả lời tốt:** trích mã upstream (tệp / hàm + URL commit) và đặc tả.</w:t>
+      </w:r>
+    </w:p>
+    <w:p>
+      <w:pPr>
+        <w:pStyle w:val="Heading3"/>
+      </w:pPr>
+      <w:r>
+        <w:t>D3-10 — `File.Replace` (`ReplaceFile`) lỗi 1175 (0x80070497) chập chờn khi tệp nằm trong cây làm việc: gốc là gì, ghi nguyên tử thế nào cho đúng trên Windows?</w:t>
+      </w:r>
+    </w:p>
+    <w:p>
+      <w:pPr>
+        <w:pStyle w:val="ListNumber"/>
+      </w:pPr>
+      <w:r>
+        <w:t>**Bối cảnh:** TieuLongNu ghi cấu hình kiểu `WriteAllLines(.tmp)` → `File.Replace(tmp, dich, null)` (`SourceCode/AppCo_TieuLongNu/TieuLongNu.App/KhungCongCu.cs:820-822`). Thăm dò 02/10 ~22:00 (sổ `_LANE_NOTE/lock/w_tln_post13_0210_2026-10-02.md` §5, mã `LaneScratch/w_tln_post13_0210/r4/do_replace.cs`, tệp mới trong thư mục GUID mới, lặp cố định): thư mục TẠM nằm trong cây repo ⇒ **7/2000** rồi **9/4000** lần `IOException 0x80070497 «Unable to remove the file to be replaced»`; `%LOCALAPPDATA%/Temp` **0/4000**; thư mục ngoài repo **0/4000**. Cùng họ: ComfyUI_Pro `KhoHoSoKenh` (`File.Replace` ném 1/3 lượt, sổ `_LANE_NOTE/lock/w_comfy_phude_0210_2026-10-02.md` §3), BookTool Engine Fight `EngineFightNapNet.cs:439,534`, `GhiManifest` (T-28).</w:t>
+      </w:r>
+    </w:p>
+    <w:p>
+      <w:pPr>
+        <w:pStyle w:val="ListNumber"/>
+      </w:pPr>
+      <w:r>
+        <w:t>**Đội đã chọn:** hàm chung `NhatKy.ThayTepNguyenTu(tmp, dich)` = Replace/Move + thử lại CÓ TRẦN (6 lần, chờ 10 → 160 ms, tổng ≤ ~0,3 s) CHỈ với mã 32 / 33 / 1175 / 1176; hết trần vẫn NÉM (bên gọi báo lỗi như cũ, tệp bị giữ HẲN vẫn là lỗi). Sau vá: cổng `--autonut-selftest` 30/30 lượt xanh (bản cũ cùng thư mục: 1/11 lượt đỏ).</w:t>
+      </w:r>
+    </w:p>
+    <w:p>
+      <w:pPr>
+        <w:pStyle w:val="ListNumber"/>
+      </w:pPr>
+      <w:r>
+        <w:t>**Phương án khác:** (a) `MoveFileEx(MOVEFILE_REPLACE_EXISTING | MOVEFILE_WRITE_THROUGH)` thay `ReplaceFile`; (b) `SetFileInformationByHandle(FileRenameInfoEx, FILE_RENAME_FLAG_POSIX_SEMANTICS)`; (c) loại thư mục khỏi Defender / Windows Search / IDE watcher (không kiểm soát được trên máy khách).</w:t>
+      </w:r>
+    </w:p>
+    <w:p>
+      <w:pPr>
+        <w:pStyle w:val="ListNumber"/>
+      </w:pPr>
+      <w:r>
+        <w:t>**Câu hỏi:** (i) Tiến trình nào thường giữ handle vài ms làm `ReplaceFile` trả 1175 (Defender real-time, Windows Search indexer, trình theo dõi tệp của IDE, Google Drive / OneDrive)? Process Monitor lọc thế nào để xác nhận? (ii) Cách ghi «nguyên tử + bền» được khuyến nghị trên NTFS hiện nay (ReplaceFile vs MoveFileEx vs rename POSIX), cách nào ít nhạy với handle mở có `FILE_SHARE_DELETE` của bên thứ ba? (iii) Số lần / khoảng thử lại như đội có hợp lý?</w:t>
+      </w:r>
+    </w:p>
+    <w:p>
+      <w:pPr>
+        <w:pStyle w:val="ListNumber"/>
+      </w:pPr>
+      <w:r>
+        <w:t>**Trả lời tốt:** tài liệu Microsoft Learn (URL) + nguồn uy tín (Raymond Chen, Windows Internals); số đo nếu có.</w:t>
+      </w:r>
+    </w:p>
+    <w:p>
+      <w:pPr>
+        <w:pStyle w:val="Heading3"/>
+      </w:pPr>
+      <w:r>
+        <w:t>D3-11 — llama.cpp trên Windows: phần nào của model tính vào COMMIT CHARGE (GGUF mmap, KV cache, offload Vulkan / ROCm trên iGPU UMA)?</w:t>
+      </w:r>
+    </w:p>
+    <w:p>
+      <w:pPr>
+        <w:pStyle w:val="ListNumber"/>
+      </w:pPr>
+      <w:r>
+        <w:t>**Bối cảnh:** sự cố 02/10 14:15:59: máy đội sập vì cạn commit (52,2 / 53,4 GB) trong khi RAM vật lý còn trống. Local AI bật server llama riêng (cổng 81xx) cho model GGUF người dùng tải. Máy owner: AMD Ryzen AI MAX+ 395, iGPU 8060S (UMA), 47,6 GB RAM, pagefile ~4,3 GB ⇒ commit limit ~51,9 GB. Commit đo bằng `K32GetPerformanceInfo` (CommitTotal / CommitLimit × PageSize).</w:t>
+      </w:r>
+    </w:p>
+    <w:p>
+      <w:pPr>
+        <w:pStyle w:val="ListNumber"/>
+      </w:pPr>
+      <w:r>
+        <w:t>**Đội đã chọn** (`SourceCode/LocalAI/TaiModel/MayChuModel.cs` bản chép T-38c; sổ `_LANE_NOTE/lock/w_localai_t38c_0210_2026-10-02.md` mục 6): tính TRỌN «RAM ước» = cỡ tệp × 1,2 + 1,5 GiB vào commit trước khi bật; trần 75 % commit limit; không đọc được commit ⇒ KHÔNG bật — bảo thủ.</w:t>
+      </w:r>
+    </w:p>
+    <w:p>
+      <w:pPr>
+        <w:pStyle w:val="ListNumber"/>
+      </w:pPr>
+      <w:r>
+        <w:t>**Phương án khác:** (a) chỉ tính KV cache + bộ đệm (vì GGUF mmap là trang ánh xạ tệp, có thể không tính commit); (b) tính cả trọng số khi `--no-mmap` / `--mlock` hoặc khi offload lên GPU UMA.</w:t>
+      </w:r>
+    </w:p>
+    <w:p>
+      <w:pPr>
+        <w:pStyle w:val="ListNumber"/>
+      </w:pPr>
+      <w:r>
+        <w:t>**Câu hỏi:** trên Windows 11 với llama.cpp (llama-server) bản mới: (i) trang GGUF ánh xạ chỉ-đọc (`CreateFileMapping` trên tệp) có tính vào commit charge không? (ii) Khi offload lên iGPU UMA qua Vulkan (hoặc HIP / ROCm), bộ nhớ «VRAM» chia sẻ được cấp phát thế nào — có tính commit / «Shared GPU memory» không? (iii) Có công thức ước commit theo (cỡ tệp, `n_ctx`, `n_gpu_layers`, kiểu KV) nào được công bố?</w:t>
+      </w:r>
+    </w:p>
+    <w:p>
+      <w:pPr>
+        <w:pStyle w:val="ListNumber"/>
+      </w:pPr>
+      <w:r>
+        <w:t>**Trả lời tốt:** dẫn mã llama.cpp (tệp mmap, backend ggml-vulkan / ggml-hip) + tài liệu Microsoft về commit charge của section / heap; số đo nếu có.</w:t>
+      </w:r>
+    </w:p>
+    <w:p>
+      <w:pPr>
+        <w:pStyle w:val="Heading3"/>
+      </w:pPr>
+      <w:r>
+        <w:t>D3-12 — Clone giọng tiếng Việt: F5-TTS ViVoice là CC-BY-NC-SA-4.0 — mô hình nào cho phép THƯƠNG MẠI; các thông số mặc định của đội có khớp model card không?</w:t>
+      </w:r>
+    </w:p>
+    <w:p>
+      <w:pPr>
+        <w:pStyle w:val="ListNumber"/>
+      </w:pPr>
+      <w:r>
+        <w:t>**Bối cảnh:** T-49 (sổ `_LANE_NOTE/lock/w_comfy_clonegiong_0210_2026-10-02.md` §1–§2): adapter `NguonF5Tts` trong `SourceCode/Shared/GiongPhuDe/F5TtsEngine.cs`; model `hynt/F5-TTS-Vietnamese-ViVoice` `model_last.pt` 5.394.362.124 B, vocab 2.566 dòng, giấy phép theo API HF **CC-BY-NC-SA-4.0** (`SourceCode/ComfyUI_Pro/ComfyUIPro/Assets/kho/goi_toi_thieu_F.json:291-299`) ⇒ giao diện gắn nhãn «THỬ NGHIỆM · CC-BY-NC-SA · không thương mại». Chưa chạy thật (môi trường python thiếu gói `f5_tts`; vocoder `charactr/vocos-mel-24khz` chưa có trên máy).</w:t>
+      </w:r>
+    </w:p>
+    <w:p>
+      <w:pPr>
+        <w:pStyle w:val="ListNumber"/>
+      </w:pPr>
+      <w:r>
+        <w:t>**Đội đã chọn:** kiến trúc `F5TTS_Base`; mẫu người dùng 10–30 s, đoạn LƯU ≤ 12 s cắt đúng biên câu whisper (F5 tự cắt mẫu &gt; 12 s mà giữ nguyên chữ ⇒ lệch lời); một giọng clone cho cả lượt, chỉ áp tiếng Việt; KHÔNG chuẩn hoá chữ tiếng Việt (số, viết tắt) trước khi đọc.</w:t>
+      </w:r>
+    </w:p>
+    <w:p>
+      <w:pPr>
+        <w:pStyle w:val="ListNumber"/>
+      </w:pPr>
+      <w:r>
+        <w:t>**Phương án khác:** (a) xin giấy phép thương mại từ tác giả ViVoice / chủ bộ dữ liệu gốc; (b) mô hình khác (VieNeu-TTS, XTTS-v2, F5-TTS gốc, Piper tiếng Việt không clone…) — giấy phép từng cái đội chưa kiểm; (c) app không kèm model, người dùng tự tải và tự chịu giấy phép.</w:t>
+      </w:r>
+    </w:p>
+    <w:p>
+      <w:pPr>
+        <w:pStyle w:val="ListNumber"/>
+      </w:pPr>
+      <w:r>
+        <w:t>**Câu hỏi:** (i) Mô hình TTS / clone giọng tiếng Việt nào hiện có TRỌNG SỐ giấy phép cho phép thương mại (Apache / MIT / CC-BY), chất lượng (MOS / WER) có nguồn? (ii) Phương án (c) có thật sự tách trách nhiệm khi app bán có nút «tải model» không? (iii) Kiến trúc, độ dài mẫu tham chiếu, chuẩn hoá chữ của đội có khớp model card ViVoice không?</w:t>
+      </w:r>
+    </w:p>
+    <w:p>
+      <w:pPr>
+        <w:pStyle w:val="ListNumber"/>
+      </w:pPr>
+      <w:r>
+        <w:t>**Trả lời tốt:** URL model card + dòng giấy phép nguyên văn; số MOS / WER có nguồn; ô nào không chắc ghi «không biết».</w:t>
+      </w:r>
+    </w:p>
+    <w:p>
+      <w:pPr>
+        <w:pStyle w:val="Heading3"/>
+      </w:pPr>
+      <w:r>
+        <w:t>D3-13 — Lồng tiếng: Demucs 2 bè giữ nhạc nền, ngưỡng «còn sót giọng» 0,3, chia whisper theo khoảng lặng ≤ 60 s — có cách chuẩn hơn?</w:t>
+      </w:r>
+    </w:p>
+    <w:p>
+      <w:pPr>
+        <w:pStyle w:val="ListNumber"/>
+      </w:pPr>
+      <w:r>
+        <w:t>**Bối cảnh:** T-45 / T-46 (sổ `_LANE_NOTE/lock/w_comfy_longtieng_0210_2026-10-02.md` §1–§2): trước vá trộn `[0:a]volume=0.15` ⇒ giọng gốc còn nằm dưới giọng lồng (`SourceCode/ComfyUI_Pro/ComfyUIPro/Core/PhimSubVoice.cs:363-364` bản cũ); whisper có hạn cố định 120 s ⇒ video dài ra 0 sub (`SourceCode/Shared/GiongPhuDe/WhisperRunner.cs:114`). Demucs dùng model `htdemucs` (`SourceCode/ComfyUI_Pro/ComfyUIPro/Core/LamNhac.cs:112-157`).</w:t>
+      </w:r>
+    </w:p>
+    <w:p>
+      <w:pPr>
+        <w:pStyle w:val="ListNumber"/>
+      </w:pPr>
+      <w:r>
+        <w:t>**Đội đã chọn:** Demucs `--two-stems vocals` (htdemucs), BẬT mặc định khi lồng tiếng; kiểm bè nền bằng hệ số chiếu `Σ nền·giọng / Σ giọng²` trong khe thoại: &lt; 0,3 ⇒ dùng, ≥ 0,3 ⇒ lùi khử kênh ffmpeg `pan c0-c1` + báo; chia wav bằng ffmpeg `silencedetect=noise=-35dB:d=0.35`, đoạn 15–60 s, không có khoảng lặng ⇒ cắt cứng 60 s, chỉ chia khi &gt; 75 s; hạn whisper mỗi đoạn = 60 + 4 × số giây (kẹp 120…1800 s).</w:t>
+      </w:r>
+    </w:p>
+    <w:p>
+      <w:pPr>
+        <w:pStyle w:val="ListNumber"/>
+      </w:pPr>
+      <w:r>
+        <w:t>**Phương án khác:** (a) `htdemucs_ft` / MDX-Net (UVR) cho bè sạch hơn; (b) VAD có sẵn của whisper.cpp (Silero) thay `silencedetect`; (c) đo rò giọng bằng cách cho whisper đọc bè nền (ra chữ ⇒ còn giọng) hoặc SI-SDR ước lượng.</w:t>
+      </w:r>
+    </w:p>
+    <w:p>
+      <w:pPr>
+        <w:pStyle w:val="ListNumber"/>
+      </w:pPr>
+      <w:r>
+        <w:t>**Câu hỏi:** (i) Model tách nào cho bè «nhạc + hiệu ứng, không giọng» tốt nhất hiện nay (bảng MUSDB18 / MVSEP có nguồn), chạy được CPU hoặc ROCm trên Windows? (ii) Thước đo rò giọng nào đáng tin hơn hệ số chiếu, ngưỡng gợi ý? (iii) whisper.cpp bản mới có VAD tích hợp — có nên thay chia theo `silencedetect`, ảnh hưởng gì tới mốc thời gian sub?</w:t>
+      </w:r>
+    </w:p>
+    <w:p>
+      <w:pPr>
+        <w:pStyle w:val="ListNumber"/>
+      </w:pPr>
+      <w:r>
+        <w:t>**Trả lời tốt:** URL bảng xếp hạng / README chính thức + phiên bản; cờ dòng lệnh chính xác.</w:t>
+      </w:r>
+    </w:p>
+    <w:p>
+      <w:pPr>
+        <w:pStyle w:val="Heading3"/>
+      </w:pPr>
+      <w:r>
+        <w:t>D3-14 — Phân giới người nói theo F0 (vùng mơ hồ 165–180 Hz) để chọn giọng lồng và xưng hô tiếng Việt — có cách tốt hơn chạy offline?</w:t>
+      </w:r>
+    </w:p>
+    <w:p>
+      <w:pPr>
+        <w:pStyle w:val="ListNumber"/>
+      </w:pPr>
+      <w:r>
+        <w:t>**Bối cảnh:** `SourceCode/Shared/GiongPhuDe/GenderDetector.cs:7-36`: F0 &lt; 165 Hz ⇒ nam, &gt; 180 Hz ⇒ nữ, khoảng giữa ⇒ giữ kết quả trước (hysteresis). T-47 đo cửa sổ 0,5 s trong khe mỗi câu, bỏ phiếu, lưu `&lt;srt&gt;.gioi.json`. Trước vá, dịch sang tiếng Việt ép xưng hô giọng nữ cho MỌI câu (`SourceCode/Shared/GiongPhuDe/TranslationService.cs:80-84,287-288`, `NguoiNoiLaNu = true`).</w:t>
+      </w:r>
+    </w:p>
+    <w:p>
+      <w:pPr>
+        <w:pStyle w:val="ListNumber"/>
+      </w:pPr>
+      <w:r>
+        <w:t>**Đội đã chọn:** câu không đo được giới (mơ hồ / im lặng) ⇒ giọng «bất kỳ» + KHÔNG đổi xưng hô (giữ bản dịch trung tính); mỗi tiếng đích chọn «theo người nói (F0) / luôn Nữ / luôn Nam / bất kỳ».</w:t>
+      </w:r>
+    </w:p>
+    <w:p>
+      <w:pPr>
+        <w:pStyle w:val="ListNumber"/>
+      </w:pPr>
+      <w:r>
+        <w:t>**Phương án khác:** (a) diarization (pyannote) + phân loại giới trên embedding (ECAPA / wav2vec2); (b) LLM đoán giới từ ngữ cảnh lời thoại; (c) người dùng gán giới cho từng người nói.</w:t>
+      </w:r>
+    </w:p>
+    <w:p>
+      <w:pPr>
+        <w:pStyle w:val="ListNumber"/>
+      </w:pPr>
+      <w:r>
+        <w:t>**Câu hỏi:** model phân loại giới / diarization nào chạy offline trên Windows CPU (ONNX), độ chính xác công bố trên giọng châu Á, giấy phép cho thương mại? Ngưỡng F0 165 / 180 Hz có nguồn ngữ âm học không (giọng trẻ em, người già)?</w:t>
+      </w:r>
+    </w:p>
+    <w:p>
+      <w:pPr>
+        <w:pStyle w:val="ListNumber"/>
+      </w:pPr>
+      <w:r>
+        <w:t>**Trả lời tốt:** tên model + URL + giấy phép + số đo; nguồn cho ngưỡng F0.</w:t>
+      </w:r>
+    </w:p>
+    <w:p>
+      <w:pPr>
+        <w:pStyle w:val="Heading3"/>
+      </w:pPr>
+      <w:r>
+        <w:t>D3-15 — Phụ đề chuyên nghiệp: karaoke `\kf` cho BẢN DỊCH, dò sub cứng bằng OCR Windows, che bằng hộp đặc — có ổn không?</w:t>
+      </w:r>
+    </w:p>
+    <w:p>
+      <w:pPr>
+        <w:pStyle w:val="ListNumber"/>
+      </w:pPr>
+      <w:r>
+        <w:t>**Bối cảnh:** T-48 `SourceCode/ComfyUI_Pro/ComfyUIPro/Core/PhuDeChuyenNghiep.cs` (sổ `_LANE_NOTE/lock/w_comfy_phude_0210_2026-10-02.md` §1–§2): đốt sub qua `.ass`; nhịp từ lấy từ lượt whisper thứ 2 `-ml 1` (+ `-sow`, trừ zh / ja / ko / th…); OCR là OCR có sẵn của Windows (WinRT). Đo hộp che: OCR đọc 0 ký tự ở cả độ đục 0,85 / 0,95 / 1.</w:t>
+      </w:r>
+    </w:p>
+    <w:p>
+      <w:pPr>
+        <w:pStyle w:val="ListNumber"/>
+      </w:pPr>
+      <w:r>
+        <w:t>**Đội đã chọn:** luôn đốt qua `.ass` (chữ trắng, viền đen 0,28 % chiều cao, cỡ 5,2 %, lề dưới 6 %); karaoke `\kf`, ánh xạ mốc theo TỈ LỆ ký tự (áp cả cho bản dịch — mốc ƯỚC LƯỢNG); dò sub cứng: 12 khung đều, dòng có tâm ≥ 45 % chiều cao, cần ≥ 2 khung và ≥ 20 % số khung; che bằng hộp đặc độ đục 1 (lý do thẩm mỹ); kiểm lại 2 khung sau khi che, còn chữ ⇒ không đốt; gói OCR theo tiếng của video (zh ⇒ zh-Hans-CN, ja / ko, còn lại en-US).</w:t>
+      </w:r>
+    </w:p>
+    <w:p>
+      <w:pPr>
+        <w:pStyle w:val="ListNumber"/>
+      </w:pPr>
+      <w:r>
+        <w:t>**Phương án khác:** (a) karaoke bản dịch bằng căn chỉnh cưỡng bức (forced alignment) trên audio lồng tiếng; (b) xoá sub cứng bằng inpaint video (ProPainter, LaMa, `video-subtitle-remover`); (c) PaddleOCR thay OCR Windows cho chữ Trung.</w:t>
+      </w:r>
+    </w:p>
+    <w:p>
+      <w:pPr>
+        <w:pStyle w:val="ListNumber"/>
+      </w:pPr>
+      <w:r>
+        <w:t>**Câu hỏi:** (i) Karaoke cho câu DỊCH (không có audio của chính câu dịch) — thực hành của fansub / Aegisub là gì? (ii) Công cụ xoá sub cứng offline nào chất lượng tốt, giấy phép thương mại, chạy được Windows CPU hoặc ROCm? (iii) OCR Windows với chữ Trung giản thể trong video có số lỗi công bố so với PaddleOCR không?</w:t>
+      </w:r>
+    </w:p>
+    <w:p>
+      <w:pPr>
+        <w:pStyle w:val="ListNumber"/>
+      </w:pPr>
+      <w:r>
+        <w:t>**Trả lời tốt:** tên công cụ + URL + giấy phép + yêu cầu phần cứng.</w:t>
+      </w:r>
+    </w:p>
+    <w:p>
+      <w:pPr>
+        <w:pStyle w:val="Heading3"/>
+      </w:pPr>
+      <w:r>
+        <w:t>D3-16 — SDXL-Lightning / AnimateDiff-Lightning trong ComfyUI: cfg 1.0 · `euler` · `sgm_uniform` · đúng N bước — có đúng model card?</w:t>
+      </w:r>
+    </w:p>
+    <w:p>
+      <w:pPr>
+        <w:pStyle w:val="ListNumber"/>
+      </w:pPr>
+      <w:r>
+        <w:t>**Bối cảnh:** `SourceCode/ComfyUI_Pro/ComfyUIPro/Core/Templates.cs:843-861` (trước vá) không có nhánh Lightning ⇒ checkpoint `sdxl_lightning_4step` chạy cfg 6–7 + `dpmpp_2m/karras` + 25–30 bước ⇒ ảnh cháy; «Chế độ nháp» (`Core/CheDoNhap.cs:37-39`) hạ mọi KSampler `steps &gt; 4` về ⌈s/3⌉ ⇒ bản 8 bước bị ép 4 (sổ `_LANE_NOTE/lock/w_t13_vua_0210_2026-10-02.md` §1h).</w:t>
+      </w:r>
+    </w:p>
+    <w:p>
+      <w:pPr>
+        <w:pStyle w:val="ListNumber"/>
+      </w:pPr>
+      <w:r>
+        <w:t>**Đội đã chọn:** tên chứa «lightning» (không phải FLUX) ⇒ cfg 1.0 · `euler` · `sgm_uniform` · không câu phủ định · steps = N đọc từ «Nstep» trong tên (không có ⇒ 4); chế độ nháp KHÔNG đổi workflow có loader tên Lightning (ckpt / LoRA / unet).</w:t>
+      </w:r>
+    </w:p>
+    <w:p>
+      <w:pPr>
+        <w:pStyle w:val="ListNumber"/>
+      </w:pPr>
+      <w:r>
+        <w:t>**Phương án khác:** sampler / scheduler riêng cho bản 1-bước, 2-bước (UNet vs LoRA); cho cfg &gt; 1 với LoRA Lightning khi cần câu phủ định.</w:t>
+      </w:r>
+    </w:p>
+    <w:p>
+      <w:pPr>
+        <w:pStyle w:val="ListNumber"/>
+      </w:pPr>
+      <w:r>
+        <w:t>**Câu hỏi:** model card ByteDance `SDXL-Lightning` và `AnimateDiff-Lightning` khuyến nghị CHÍNH XÁC sampler / scheduler / cfg / steps nào cho ComfyUI (kể cả bản 1-bước có cần chế độ dự đoán đặc biệt không)? LoRA Lightning ghép vào checkpoint SDXL khác có cần đổi tham số gì?</w:t>
+      </w:r>
+    </w:p>
+    <w:p>
+      <w:pPr>
+        <w:pStyle w:val="ListNumber"/>
+      </w:pPr>
+      <w:r>
+        <w:t>**Trả lời tốt:** trích model card Hugging Face (URL), một câu nguyên văn cho mỗi ý.</w:t>
+      </w:r>
+    </w:p>
+    <w:p>
+      <w:pPr>
+        <w:pStyle w:val="Heading3"/>
+      </w:pPr>
+      <w:r>
+        <w:t>D3-17 — Đăng video đa nền tảng: API chính thức (YouTube Data v3, TikTok Content Posting, Facebook Graph) hay tự lái trang creator trong WebView2?</w:t>
+      </w:r>
+    </w:p>
+    <w:p>
+      <w:pPr>
+        <w:pStyle w:val="ListNumber"/>
+      </w:pPr>
+      <w:r>
+        <w:t>**Bối cảnh:** T-44 / T-50 ComfyUI_Pro (sổ `_LANE_NOTE/lock/w_comfy_dang_tai_0210_2026-10-02.md` §1–§2): owner tự đăng nhập nền tảng trong WebView2 riêng (app không gõ / lưu mật khẩu, gặp kiểm tra người ⇒ dừng êm báo owner). Tải bằng yt-dlp — extractor có sẵn: TikTok, Douyin (chỉ từng video), Bilibili (kênh + `bilisearch`), YouTube `ytsearch`, Facebook reel, Instagram user, Xiaohongshu (từng mục); KHÔNG có Kuaishou.</w:t>
+      </w:r>
+    </w:p>
+    <w:p>
+      <w:pPr>
+        <w:pStyle w:val="ListNumber"/>
+      </w:pPr>
+      <w:r>
+        <w:t>**Đội đã chọn:** YouTube / Facebook: owner dán token (lưu DPAPI) ⇒ đi API (resumable upload / Graph `/videos`), chưa có ⇒ tự lái creator studio trong WebView2 đã đăng nhập; TikTok Content Posting API cần app audit ⇒ ghi «API chưa được duyệt — dùng tự lái»; nguồn riêng tư ⇒ xuất cookie của hồ sơ WebView2 ra tệp Netscape TẠM cho yt-dlp, xoá ngay sau lượt; lịch đăng lặp ngày / tuần, lỡ giờ khi app tắt ⇒ chạy bù đúng một lần.</w:t>
+      </w:r>
+    </w:p>
+    <w:p>
+      <w:pPr>
+        <w:pStyle w:val="ListNumber"/>
+      </w:pPr>
+      <w:r>
+        <w:t>**Phương án khác:** chỉ API (bỏ tự lái); dịch vụ trung gian có API (Buffer, Hootsuite…); không tự đăng, chỉ chuẩn bị gói để owner bấm.</w:t>
+      </w:r>
+    </w:p>
+    <w:p>
+      <w:pPr>
+        <w:pStyle w:val="ListNumber"/>
+      </w:pPr>
+      <w:r>
+        <w:t>**Câu hỏi:** (i) Hạn mức + điều kiện duyệt hiện hành: YouTube Data API v3 upload (quota mỗi video; video từ dự án chưa kiểm toán có bị khoá «private» không), TikTok Content Posting API (audit, giới hạn khi chưa audit), Facebook Graph đăng video (quyền cần)? (ii) Điều khoản các nền tảng nói gì về tự động hoá giao diện web khi CHÍNH CHỦ tài khoản đã đăng nhập — rủi ro khoá tài khoản thực tế? (iii) Douyin / Kuaishou có API đăng chính thức cho tài khoản ngoài Trung Quốc không?</w:t>
+      </w:r>
+    </w:p>
+    <w:p>
+      <w:pPr>
+        <w:pStyle w:val="ListNumber"/>
+      </w:pPr>
+      <w:r>
+        <w:t>**Trả lời tốt:** URL tài liệu developer chính thức + câu điều khoản; số quota kèm ngày của tài liệu.</w:t>
+      </w:r>
+    </w:p>
+    <w:p>
+      <w:pPr>
+        <w:pStyle w:val="Heading3"/>
+      </w:pPr>
+      <w:r>
+        <w:t>D3-18 — AUTO cho JJ象棋 khi bundle ảnh bị mã hoá và owner KHÔNG có tài khoản: lấy mẫu bàn / quân hợp pháp ở đâu, hay nhận dạng không cần mẫu skin?</w:t>
+      </w:r>
+    </w:p>
+    <w:p>
+      <w:pPr>
+        <w:pStyle w:val="ListNumber"/>
+      </w:pPr>
+      <w:r>
+        <w:t>**Bối cảnh** (`AI_Debate/onGoing/PHIEU_JJCHESS_LOGIN_2026-09-26.md` §5–§10): ảnh bàn / quân JJ nằm trong 1.568 bundle UnityFS có trường version là hằng `0x3FCB9E08`, blockInfo không giải được LZ4 (quét XOR 1 byte: 0 khoá) ⇒ mã hoá riêng; đội KHÔNG bẻ (biện pháp bảo vệ kỹ thuật + bản quyền). Bóc được 95 ảnh RawRes + 189 PNG giao diện — 0 bàn / quân. Màn đăng nhập JJ: SĐT / mật khẩu / 微信 / QQ / 抖音 / 支付宝 — KHÔNG có «Khách». Điều khoản `www.jj.cn/agreement/regService.html` cấm client trái phép và «外挂 / 机器人». TieuLongNu AUTO đi bằng nhận dạng màn hình (chụp + `SendInput`) và đã có đường nhận bàn từ ảnh; trang JJ (đăng nhập do khách tự làm) đã ghép vào TieuLongNu (ghép 13).</w:t>
+      </w:r>
+    </w:p>
+    <w:p>
+      <w:pPr>
+        <w:pStyle w:val="ListNumber"/>
+      </w:pPr>
+      <w:r>
+        <w:t>**Đội đã chọn:** TieuLongNu chỉ làm trang đăng nhập + kênh, KHÁCH tự đăng nhập tài khoản của họ; AUTO dùng nhận dạng màn hình trên máy khách; bộ mẫu skin JJ chỉ lấy bằng chụp màn hình một ván thật khi có tài khoản — hiện CHƯA có.</w:t>
+      </w:r>
+    </w:p>
+    <w:p>
+      <w:pPr>
+        <w:pStyle w:val="ListNumber"/>
+      </w:pPr>
+      <w:r>
+        <w:t>**Phương án khác:** (a) bộ nhận dạng tổng quát nhiều skin (YOLO train trên nhiều GUI, vd mô hình của dự án GPLv3 VinXiangQi) không cần mẫu JJ; (b) ảnh từ video / ảnh cửa hàng ứng dụng công khai của JJ (vướng bản quyền nếu đưa vào sản phẩm); (c) người dùng tự «dạy mẫu» lần đầu (chọn 2 Xe — câu M-02).</w:t>
+      </w:r>
+    </w:p>
+    <w:p>
+      <w:pPr>
+        <w:pStyle w:val="ListNumber"/>
+      </w:pPr>
+      <w:r>
+        <w:t>**Câu hỏi:** (i) JJ象棋 có chế độ xem ván (观战) hoặc bản web nào xem được bàn KHÔNG cần đăng nhập không? (ii) Có bộ dữ liệu / model nhận dạng bàn-quân cờ tướng công khai, giấy phép rõ, tổng quát qua nhiều skin (kể cả 3D), độ chính xác công bố? (iii) Dùng ảnh chụp màn hình JJ CHỈ làm dữ liệu train nội bộ cho bộ nhận dạng (không phân phối ảnh) có rủi ro bản quyền gì?</w:t>
+      </w:r>
+    </w:p>
+    <w:p>
+      <w:pPr>
+        <w:pStyle w:val="ListNumber"/>
+      </w:pPr>
+      <w:r>
+        <w:t>**Trả lời tốt:** URL hoặc ảnh chứng minh cho (i); tên repo + giấy phép + số đo cho (ii); nguồn pháp lý cho (iii) hoặc «không chắc».</w:t>
+      </w:r>
+    </w:p>
+    <w:p>
+      <w:pPr>
+        <w:pStyle w:val="Heading3"/>
+      </w:pPr>
+      <w:r>
+        <w:t>D3-19 — Gói Demo dùng Docco (fork Fairy-Stockfish, GPLv3) + GUI đóng nguồn có khoá hết hạn: thế nào là đủ tuân thủ GPLv3?</w:t>
+      </w:r>
+    </w:p>
+    <w:p>
+      <w:pPr>
+        <w:pStyle w:val="ListNumber"/>
+      </w:pPr>
+      <w:r>
+        <w:t>**Bối cảnh** (sổ `_LANE_NOTE/lock/w_demo_cc0_0210_2026-10-02.md` §1–§2): gói `TieuLongNu_Demo` bỏ Pikafish (net official đã ném), thay bằng Docco exe (bản không có cổng key) đổi tên `docco.exe` + net CC0 `xiangqi-c07e94a5c7cb.nnue` (giữ tên gốc upstream) + `doccocaubai_config.ini` (tên bắt buộc theo mã). Kèm `SOURCE_GPL.zip` sinh TÁI LẬP từ commit nguồn (116 mục, 823.003 B, sinh 2 lần cùng byte, 0 tệp nguồn lệch), `Copying.txt`, `NET_CC0_LICENSE.txt`, README 3 ngôn ngữ. GUI TieuLongNu (đóng nguồn, tiến trình riêng, nói UCI qua stdin / stdout) có khoá dùng thử: hết hạn xoá **net CC0 + tệp dùng thử** (KHÔNG xoá exe GPL) rồi GUI tự thoát.</w:t>
+      </w:r>
+    </w:p>
+    <w:p>
+      <w:pPr>
+        <w:pStyle w:val="ListNumber"/>
+      </w:pPr>
+      <w:r>
+        <w:t>**Đội đã chọn:** như trên — coi GUI + engine là hai chương trình riêng gộp chung («aggregate»); kèm sẵn source GPL trong gói (không chỉ offer bằng văn bản).</w:t>
+      </w:r>
+    </w:p>
+    <w:p>
+      <w:pPr>
+        <w:pStyle w:val="ListNumber"/>
+      </w:pPr>
+      <w:r>
+        <w:t>**Phương án khác:** (a) offer bằng văn bản 3 năm thay vì kèm zip; (b) không đổi tên exe; (c) không cho khoá dùng thử đụng bất kỳ tệp nào trong thư mục engine.</w:t>
+      </w:r>
+    </w:p>
+    <w:p>
+      <w:pPr>
+        <w:pStyle w:val="ListNumber"/>
+      </w:pPr>
+      <w:r>
+        <w:t>**Câu hỏi:** (i) Đổi tên binary GPL + kèm zip source đúng commit có đủ «Corresponding Source» (GPLv3 §1 — gồm script build / CMake) không, có phải kèm toolchain / cờ build không? (ii) Khoá hết hạn của GUI xoá tệp net (CC0, không phải GPL) có bị coi là «hạn chế thêm» (§10) với engine GPL không? (iii) README có phải ghi rõ engine là bản sửa đổi kèm ngày sửa (§5a) không?</w:t>
+      </w:r>
+    </w:p>
+    <w:p>
+      <w:pPr>
+        <w:pStyle w:val="ListNumber"/>
+      </w:pPr>
+      <w:r>
+        <w:t>**Trả lời tốt:** trích điều GPLv3 có số mục + GPL FAQ của FSF (URL: «aggregate», «Corresponding Source»); «không chắc» nếu không có nguồn.</w:t>
+      </w:r>
+    </w:p>
+    <w:p>
+      <w:pPr>
+        <w:pStyle w:val="Heading3"/>
+      </w:pPr>
+      <w:r>
+        <w:t>D3-20 — Meeting AI tự lái web: khi phiên web của CHÍNH BẠN hết hạn, trang hiện gì, và gửi lại câu hỏi thế nào để không trùng?</w:t>
+      </w:r>
+    </w:p>
+    <w:p>
+      <w:pPr>
+        <w:pStyle w:val="ListNumber"/>
+      </w:pPr>
+      <w:r>
+        <w:t>**Bối cảnh:** Local AI «Meeting AI» lái trang chat của các AI ngoài trong WebView2 (owner tự đăng nhập; app KHÔNG BAO GIỜ gõ vào form đăng nhập). Trước vá, trang bị đăng xuất rơi vào «Lỗi» vì không thấy ô nhập (`SourceCode/LocalAI/Meeting/WebTroWebView2.cs:225-226` «KHONG_THAY_O_NHAP»). Sổ `_LANE_NOTE/lock/w_localai_t19b2_0210_2026-10-02.md` mục 3–6.</w:t>
+      </w:r>
+    </w:p>
+    <w:p>
+      <w:pPr>
+        <w:pStyle w:val="ListNumber"/>
+      </w:pPr>
+      <w:r>
+        <w:t>**Đội đã chọn:** nhận diện đăng xuất MẠNH = ô `input[type=password]` đang hiện hoặc URL đăng nhập (/login, /signin, accounts.google.com…); YẾU = chữ «log in to continue / session expired…» + mẫu `dang_nhap.mau` của hồ sơ (không tính chữ nằm trong chính câu vừa gửi); trạng thái «chờ owner đăng nhập», hạn 30 phút ⇒ «quá hạn» (không phải Lỗi); đăng xuất SAU khi đã gửi mà không còn khối trả lời ⇒ đăng nhập lại xong GỬI LẠI phần đó ĐÚNG 1 lần.</w:t>
+      </w:r>
+    </w:p>
+    <w:p>
+      <w:pPr>
+        <w:pStyle w:val="ListNumber"/>
+      </w:pPr>
+      <w:r>
+        <w:t>**Phương án khác:** không tự gửi lại, chờ owner bấm; ưu tiên API khi có.</w:t>
+      </w:r>
+    </w:p>
+    <w:p>
+      <w:pPr>
+        <w:pStyle w:val="ListNumber"/>
+      </w:pPr>
+      <w:r>
+        <w:t>**Câu hỏi** (mỗi AI trả lời cho SẢN PHẨM CỦA CHÍNH MÌNH, giống K7): khi phiên web hết hạn, (i) trang chuyển tới URL nào, phần tử nào xuất hiện (selector / aria-label nếu biết); (ii) câu trả lời đang viết dở có còn sau khi đăng nhập lại không; (iii) gửi lại cùng câu hỏi có bị chặn / đánh dấu spam không?</w:t>
+      </w:r>
+    </w:p>
+    <w:p>
+      <w:pPr>
+        <w:pStyle w:val="ListNumber"/>
+      </w:pPr>
+      <w:r>
+        <w:t>**Trả lời tốt:** mô tả kèm URL trang trợ giúp chính thức; ô nào không biết ghi «không biết» — KHÔNG bịa selector.</w:t>
+      </w:r>
+    </w:p>
+    <w:p>
+      <w:r>
+        <w:t>---</w:t>
+      </w:r>
+    </w:p>
+    <w:p>
+      <w:pPr>
+        <w:pStyle w:val="Heading2"/>
+      </w:pPr>
+      <w:r>
+        <w:t>PHẦN Q — Câu hỏi mở từ các lane (gộp 03/10/2026 06:41)</w:t>
+      </w:r>
+    </w:p>
+    <w:p>
+      <w:pPr>
+        <w:pStyle w:val="Heading3"/>
+      </w:pPr>
+      <w:r>
+        <w:t>Từ lane/tệp `fable_netchung_tancuoc_cau_hoi_20261003_0635.md`</w:t>
+      </w:r>
+    </w:p>
+    <w:p>
+      <w:pPr>
+        <w:pStyle w:val="Heading1"/>
+      </w:pPr>
+      <w:r>
+        <w:t>Câu hỏi của Fable theo lệnh owner 03/10 05:2x–05:4x (lane `fable_netchung_0310`) — cho `w_ask_sang_0310` gộp vào Ask 01</w:t>
+      </w:r>
+    </w:p>
+    <w:p>
+      <w:r>
+        <w:t>&gt; Owner nguyên văn: *«Mọi engine đều có net, thế thì cái positions endgame nó có 1 số cái có lời giải chessdb và 1 số cái chưa, thì mình lấy engine bản quyền đi phân tích rồi chiết xuất net ra cho hết rồi lồng vào net hiện tại. Tạo 1 net chung có thể nhập vào net hiện tại, nếu engine nào chưa có net thì lấy đó làm net train dần lên»* · *«những cái nào có kết quả chessdb không cần tính, những cái nào chưa có thì gom nhiều engine tính toán chỗ đó rồi merge lại gom thành 1 net; từ 4x4 quân thì lúc đó đã cơ bản có net mạnh; mỗi engine tính toán cho 4x4 khác nhau mình gom học, đưa ra nhiều phương án tính (set depth cao cho engine tính)»*.</w:t>
+      </w:r>
+    </w:p>
+    <w:p>
+      <w:r>
+        <w:t>&gt; Đã hỏi trước đây (KHÔNG hỏi lại): ASK11 Q-A…Q-H (curriculum tàn cuộc → trung cuộc, dạy mate ở net hay search, nhãn engine thương mại cho cờ thế CBL = Q-E/A3-11, lấy mẫu 26,2 tỷ thế) và Ask 01 O-06/P-03/W456-02 (nối tàn cuộc vào train, «học tàn quên trung»). Bốn câu dưới là phần CHƯA hỏi.</w:t>
+      </w:r>
+    </w:p>
+    <w:p>
+      <w:pPr>
+        <w:pStyle w:val="Heading3"/>
+      </w:pPr>
+      <w:r>
+        <w:t>NC-01 — «Một net chung» tàn cuộc có thể LỒNG vào net hiện tại của từng engine, hay làm net khởi điểm cho engine khác kiến trúc không?</w:t>
+      </w:r>
+    </w:p>
+    <w:p>
+      <w:pPr>
+        <w:pStyle w:val="ListNumber"/>
+      </w:pPr>
+      <w:r>
+        <w:t>**Bối cảnh:** đội có 3 họ net: (a) Fairy-Stockfish xiangqi (arch `0x7AF32F20/0x3C103E72`) — Docco, Bodetosu, Trương Vô Kỵ hiện nạp CÙNG một tệp CC0 `xiangqi-c07e94a5c7cb.nnue` (sha256_16 `C07E94A5C7CBEAE4`, 11.261.932 B); (b) Pikafish 2026 — OngThan avx2/bmi + ThanDieuDaiHiep (net official cấm thương mại, trainer đang port T-40); (c) net piece-square riêng — Nữ Oa/NhuLai; HongQuanLaoTo/La Hầu không NNUE. Đã đo: nạp net CC0 vào ThanDieuDaiHiep (khác arch-hash dù cùng version `0x7AF32F20`) ⇒ `ERROR`/`NETHONG`, bench 0 nút (`AI_Debate/onGoing/NGUON_ENGINE.md:99`). Thử fine-tune từ net CC0 (lô N5, 20/09) ra net **yếu hơn −301 Elo** do dữ liệu (`NGUON_ENGINE.md:103-105`). Kho nhãn tàn cuộc `positionendgame.fendb`: 11.950.107 thế (11.900.907 nhãn CHÍNH XÁC bộ giải lùi ≤ 2 quân tấn công · 47.269 chessdb · 1.931 chưa), 132.327.311 nước có xếp hạng, 62.617.776 cờ `nuoc_dung` (`SourceCode/Shared/DataFen/kho_tan_cuoc.py:102-111`, đo 03/10 06:0x).</w:t>
+      </w:r>
+    </w:p>
+    <w:p>
+      <w:pPr>
+        <w:pStyle w:val="ListNumber"/>
+      </w:pPr>
+      <w:r>
+        <w:t>**Câu hỏi:** với 3 họ kiến trúc trên, «lồng một net chung vào net hiện tại» có cách nào ngoài (i) chia sẻ TẬP NHÃN rồi fine-tune từng họ, (ii) distill từ một «thầy tàn cuộc» chung? Trong cùng họ Fairy, gộp trọng số (weight averaging / model soup) của bản fine-tune tàn cuộc với net gốc C07E94A5 có an toàn không, điều kiện gì (cùng init, cùng quantization int8 1/64)? Có kiến trúc «hai net chọn theo số quân» (kiểu Stockfish small/big net theo vật liệu) đã dùng cho cờ tướng chưa, lợi/hại so với một net?</w:t>
+      </w:r>
+    </w:p>
+    <w:p>
+      <w:pPr>
+        <w:pStyle w:val="ListNumber"/>
+      </w:pPr>
+      <w:r>
+        <w:t>**Trả lời tốt trông thế nào:** nói rõ cái KHÔNG làm được (chuyển trọng số khác arch) và cái làm được (nhãn chung, distill, averaging cùng arch) kèm nguồn (nnue-pytorch, Stockfish NNUE docs, bài model soup); công thức/điều kiện gộp trọng số; đề xuất một lịch cụ thể cho họ Fairy (net chung cho Docco/Bodetosu/TVK) và cách kiểm (A/B nodes cố định, ρ(net, −DTC) trên ô đã giải chính xác).</w:t>
+      </w:r>
+    </w:p>
+    <w:p>
+      <w:pPr>
+        <w:pStyle w:val="Heading3"/>
+      </w:pPr>
+      <w:r>
+        <w:t>NC-02 — Gom nhiều engine tính depth cao cho thế 4v4 CHƯA có nhãn: hợp nhất nhãn thế nào, depth bao nhiêu, kiểm bằng gì?</w:t>
+      </w:r>
+    </w:p>
+    <w:p>
+      <w:pPr>
+        <w:pStyle w:val="ListNumber"/>
+      </w:pPr>
+      <w:r>
+        <w:t>**Bối cảnh:** engine chấm được: 2 bản quyền (Cyclone ≤ 2 con, BugChess ≤ 2 con — mở rồi giữ, nghỉ ≥ 60 s giữa lần mở, `SourceCode/BookTool_Xiangqi/ThayBanQuyen.cs:217,247`; XQMS không giới hạn), engine nhà Docco/Bodetosu/TVK/OngThan. Số đo chi phí hiện có: thầy Docco 0,0295 s/thế @ 5.000 nút (`ncb03_job` dry200), probe chessdb 12.141 thế/7,3 h (`lo_nap` 25); chưa đo thầy bản quyền ở depth cao (câu Q5 phiếu TRAIN 25/09 còn trống). Kho có **bộ hiệu chuẩn miễn phí**: 11,9 triệu thế ≤ 2 quân tấn công đã giải CHÍNH XÁC (wdl + dtm + dtc + nước đúng) để đo sai số nhãn engine theo depth. Nhãn chessdb `W|D|L-M-n` không phải DTM thuần khi bên thua còn quân tấn công (16/63 nước ngắn hơn 1–2 ply, `tan_cuoc_liet_ke.py:1749-1752`). Mục lục tàn cuộc 42.687 ô, chỉ 24 ô XONG; 3v1…3v3 ước 10¹⁴–10²⁰ thế ⇒ phải lấy MẪU (cột `cach=MAU` 41.844 ô).</w:t>
+      </w:r>
+    </w:p>
+    <w:p>
+      <w:pPr>
+        <w:pStyle w:val="ListNumber"/>
+      </w:pPr>
+      <w:r>
+        <w:t>**Câu hỏi:** (a) giao thức hiệu chuẩn: chạy từng engine ở depth D trên mẫu của các ô đã giải chính xác ⇒ đo tỉ lệ sai WDL và sai nước đúng theo D ⇒ chọn D tối thiểu đạt sai số &lt; x %; x nên là bao nhiêu để nhãn còn có ích cho train? (b) khi 2–4 engine không đồng ý trên một thế: hợp nhất bằng bỏ phiếu WDL, lấy engine depth sâu nhất, hay giữ cả phân phối (nhãn mềm) + ghi độ bất đồng làm trọng số loss? (c) «nhiều phương án tính» = lấy MultiPV k nước tốt nhất làm nhãn chính sách — k bao nhiêu, cắt theo chênh cp nào? (d) ước thời gian: với 2 Cyclone 12 lõi + 2 BugChess 8 lõi trên PC 44 lõi (gói `sinhgame.zip`), depth ~22–26, bao nhiêu thế/giờ là thực tế và một mẫu bao lớn cho 3v2/3v3/4v4 là đủ để train (so với 11,9 triệu thế chính xác bậc ≤ 2)?</w:t>
+      </w:r>
+    </w:p>
+    <w:p>
+      <w:pPr>
+        <w:pStyle w:val="ListNumber"/>
+      </w:pPr>
+      <w:r>
+        <w:t>**Trả lời tốt trông thế nào:** giao thức đo có ngưỡng ghi TRƯỚC, công thức hợp nhất nhãn có nguồn (ensemble distillation, soft labels), ước lượng thế/giờ theo depth có cơ sở, cảnh báo bẫy (engine báo mate giả ở cờ thế — A3-11; nhãn cp ở thế hoà theo luật không ăn quân 60/80 ply).</w:t>
+      </w:r>
+    </w:p>
+    <w:p>
+      <w:pPr>
+        <w:pStyle w:val="Heading3"/>
+      </w:pPr>
+      <w:r>
+        <w:t>NC-03 — Lấy mẫu không gian 3v3/4v4 (10¹⁹–10²³ thế) để train: phân phối nào, bao nhiêu thế mỗi ô, kiểm tổng quát hoá ra sao?</w:t>
+      </w:r>
+    </w:p>
+    <w:p>
+      <w:pPr>
+        <w:pStyle w:val="ListNumber"/>
+      </w:pPr>
+      <w:r>
+        <w:t>**Bối cảnh:** owner chốt phạm vi 0v0…4v4 quân tấn công × sĩ/tượng 0→đủ, «vài chục triệu hình là đủ» (LANE_LOCK ĐP 933); đội đã có mục lục ô thấp→cao với `so_the_uoc` từng ô (`kho_tan_cuoc.py` bảng `o`), bộ giải lùi 2.099–2.832 thế/s/tiến trình nhưng 57 ô 2v1+3v0 ≈ 2,1·10⁹ thế ≈ 278 giờ-tiến trình, kho ≈ 1,1 TB ⇒ không liệt kê đủ trên máy này (`DEBATE_POSITIONENDGAME_LAM_XONG_2026-09-26.md:36-37`). Grok (Answer 01) đề nghị: không vét 4v4, bậc ≥ 2 chỉ gán nhãn mẫu, WDL chính + cp-DTM phụ. Chưa có số: bao nhiêu mẫu/ô và phân phối mẫu (ngẫu nhiên hợp lệ · từ ván thật · sát biên thắng/hoà) cho net tổng quát hoá.</w:t>
+      </w:r>
+    </w:p>
+    <w:p>
+      <w:pPr>
+        <w:pStyle w:val="ListNumber"/>
+      </w:pPr>
+      <w:r>
+        <w:t>**Câu hỏi:** cho một ô 4v4 cỡ 10¹⁵–10¹⁹ thế, phân phối mẫu nào cho NNUE học được quy luật (ngẫu nhiên đều, lấy từ ván engine, hay tập trung vùng biên WDL / dtm ngắn), cỡ mẫu tối thiểu mỗi ô theo kinh nghiệm EGTB-rescoring của Stockfish/Fairy (Syzygy ≤ 7 quân) là bao nhiêu, và kiểm tổng quát hoá bằng gì (giữ lại ô chưa thấy, đo ρ(net, WDL) + sai nước đúng trên ô giải chính xác)? Có nên ưu tiên lấy mẫu từ chính thế tàn cuộc xuất hiện trong `positions.fendb`/ván thật (cột `so_quan_tan_cong`, ĐP 943) thay vì không gian liệt kê?</w:t>
+      </w:r>
+    </w:p>
+    <w:p>
+      <w:pPr>
+        <w:pStyle w:val="ListNumber"/>
+      </w:pPr>
+      <w:r>
+        <w:t>**Trả lời tốt trông thế nào:** quy tắc lấy mẫu có nguồn (TB rescoring trong nnue-pytorch, bài về coverage của EGTB trong dữ liệu train), con số mẫu/ô theo bậc, cách kiểm tổng quát hoá, cảnh báo lệch phân phối với ván thật.</w:t>
+      </w:r>
+    </w:p>
+    <w:p>
+      <w:pPr>
+        <w:pStyle w:val="Heading3"/>
+      </w:pPr>
+      <w:r>
+        <w:t>NC-04 — Giả thuyết owner «tới 4v4 quân là cơ bản có net mạnh»: biết hết tàn cuộc ≤ 4v4 mang lại bao nhiêu Elo cho engine cờ tướng?</w:t>
+      </w:r>
+    </w:p>
+    <w:p>
+      <w:pPr>
+        <w:pStyle w:val="ListNumber"/>
+      </w:pPr>
+      <w:r>
+        <w:t>**Bối cảnh:** đội đo eval tàn cuộc yếu (pháo đài −711 vs search −8; r vùng tàn 0,57 — `AI_Debate/onGoing/CHOT_OWNER_2026-09-12_TOI.md:197`); engine nhà có EGTB probe lúc đánh (cổng `probe_uci_10fen.py`), còn net thì chưa học tàn cuộc. Owner muốn ưu tiên nguồn lực (giờ engine bản quyền, GPU) cho nhãn ≤ 4v4 trước trung cuộc (ASK11 §1 «train từ gốc lên»).</w:t>
+      </w:r>
+    </w:p>
+    <w:p>
+      <w:pPr>
+        <w:pStyle w:val="ListNumber"/>
+      </w:pPr>
+      <w:r>
+        <w:t>**Câu hỏi:** có số đo nào (Stockfish Syzygy, Pikafish/Fairy EGTB, cutechess) về Elo tăng khi engine «biết hết» tàn cuộc ≤ N quân — tách riêng (a) dùng bảng tra trong search và (b) net đã học nhãn tàn cuộc — để ước lượng phần Elo thực sự đến từ tàn cuộc ≤ 4v4 so với trung cuộc? Với cờ tướng (nhiều hoà, luật không ăn quân 60/80 ply), vùng nào của tàn cuộc đổi Elo nhiều nhất (chuyển hoá thắng, giữ hoà, pháo đài)?</w:t>
+      </w:r>
+    </w:p>
+    <w:p>
+      <w:pPr>
+        <w:pStyle w:val="ListNumber"/>
+      </w:pPr>
+      <w:r>
+        <w:t>**Trả lời tốt trông thế nào:** số Elo có nguồn (test fishtest/Pikafish, báo cáo EGTB), tách (a)/(b) rõ, kết luận thẳng giả thuyết «≤ 4v4 ⇒ net mạnh» đúng tới đâu, và gợi ý phép đo nội bộ rẻ (A/B có/không EGTB probe; A/B net tàn cuộc vs net gốc trên bộ thế tàn cuộc thật từ ván của đội).</w:t>
+      </w:r>
+    </w:p>
+    <w:p>
+      <w:pPr>
+        <w:pStyle w:val="Heading3"/>
+      </w:pPr>
+      <w:r>
+        <w:t>Từ lane/tệp `fable_soi_0310_cau_hoi_20261003_0540.md`</w:t>
+      </w:r>
+    </w:p>
+    <w:p>
+      <w:pPr>
+        <w:pStyle w:val="Heading1"/>
+      </w:pPr>
+      <w:r>
+        <w:t>Câu hỏi mở của Fable sau lượt soi chéo sáng 03/10/2026 (lane `fable_soi_0310`) — cho `w_ask_sang_0310` gộp vào Ask 01</w:t>
+      </w:r>
+    </w:p>
+    <w:p>
+      <w:pPr>
+        <w:pStyle w:val="Heading3"/>
+      </w:pPr>
+      <w:r>
+        <w:t>FS-01 — Cỡ mẫu A/B chọn net cho engine TẤT ĐỊNH (Threads 1, nodes cố định)</w:t>
+      </w:r>
+    </w:p>
+    <w:p>
+      <w:pPr>
+        <w:pStyle w:val="ListNumber"/>
+      </w:pPr>
+      <w:r>
+        <w:t>**Bối cảnh:** rig `_LANE_NOTE/_scratch_code_luu/w_net_ab_0210/ab_net.py` (trên `cong_c433a_ab_slot.chay_abngan` + BookTool `--abngan-cli`) lô mồi 02/10: Docco A=A +4 =4 −4 n=12 KTC95 [−108; +108] · đối chứng dương (×4 nodes) +12 =4 −0 n=16 Elo +338 [+176; +∞); Bodetosu A=A +2 =8 −2, dương +10 =6 −0 +255 [+96; +807]. Engine tất định ⇒ A=A luôn w=l (4/4, 4/4, 2/2) nên «KTC chứa 0» không thể trượt ngẫu nhiên; chỉ 10 thế BalancedOpenings trước khi vá `AbNganCli.DocHoSo` đọc `boThe`. 50 k nodes ≈ 1 phút/ván (`ab_net.py:78`). Ứng viên: 6 net Fairy xiangqi cũ (2022–2023, trang Fairy ghi Elo +541…+889 so +914 của C07E94A5) ⇒ chênh có thể &lt; 50 Elo.</w:t>
+      </w:r>
+    </w:p>
+    <w:p>
+      <w:pPr>
+        <w:pStyle w:val="ListNumber"/>
+      </w:pPr>
+      <w:r>
+        <w:t>**Câu hỏi:** với engine tất định, nodes cố định, bộ thế xuất phát N thế (mỗi thế 2 ván đổi màu), cần N bao nhiêu và tính KTC thế nào (pentanomial theo cặp ván?) để xếp 6 net chênh ~30–50 Elo với cận dưới KTC95 ≥ +25 Elo; có nên thay «nodes cố định» bằng «nodes ± jitter nhỏ» hay chỉ cần đa dạng thế yên (lấy từ `positions.fendb`) để tránh tương quan giữa các ván cùng thế?</w:t>
+      </w:r>
+    </w:p>
+    <w:p>
+      <w:pPr>
+        <w:pStyle w:val="ListNumber"/>
+      </w:pPr>
+      <w:r>
+        <w:t>**Trả lời tốt trông thế nào:** công thức hoặc nguồn (Elo error bars, pentanomial/SPRT của fishtest hay cutechess), con số N cụ thể cho ±25 Elo, bẫy tương quan khi dùng chung bộ thế cho mọi cặp net, và cách ước giờ máy trước khi thuê (luật đội: lô mồi chứng minh harness phân biệt được rồi mới mở lô dài).</w:t>
+      </w:r>
+    </w:p>
+    <w:p>
+      <w:pPr>
+        <w:pStyle w:val="Heading3"/>
+      </w:pPr>
+      <w:r>
+        <w:t>FS-02 — Nạp ~174 triệu FEN duy nhất vào SQLite có `fen TEXT UNIQUE`: nạp từng tệp hay gom – sắp xếp – dựng chỉ mục sau?</w:t>
+      </w:r>
+    </w:p>
+    <w:p>
+      <w:pPr>
+        <w:pStyle w:val="ListNumber"/>
+      </w:pPr>
+      <w:r>
+        <w:t>**Bối cảnh:** bước 8b bộ nạp HF (`SourceCode/Shared/DataFen/nap_fendb.py --tai-cho`, wrapper `_LANE_NOTE/_scratch_code_luu/fable_nap_hf_0210/nap_hf_8b_only.ps1`) nạp TUẦN TỰ 246 tệp FEN text (tổng 9,66 GB; 8a đã khử trùng còn 174.417.976 FEN, đã lọc hợp lệ `--hop-le`) vào kho tạm `.fendb` lược đồ `fendb(id, fen TEXT NOT NULL UNIQUE, moves, score, source)` + `nguon_lo`. Đo 03/10 04:48–05:10: 17 tệp (220 MB) trong ~6 phút ≈ 0,6 MB/s; tệp 457 MB đang nạp &gt; 15 phút, python 1 lõi 97 %, WS 2,2 GB, kho 1,27 GB; ước 5–13 giờ, và chèn ngẫu nhiên vào B-tree UNIQUE sẽ chậm dần khi bảng lớn. Máy 32 luồng / 47,6 GB RAM, commit limit 51,9 GB (đã sập 02/10 vì cạn commit), ổ C NTFS; owner có thể tắt máy giữa chừng.</w:t>
+      </w:r>
+    </w:p>
+    <w:p>
+      <w:pPr>
+        <w:pStyle w:val="ListNumber"/>
+      </w:pPr>
+      <w:r>
+        <w:t>**Câu hỏi:** cách nạp hàng loạt đúng cho SQLite ở quy mô 10⁸ dòng text UNIQUE — (a) bỏ chỉ mục UNIQUE rồi `CREATE UNIQUE INDEX` sau khi nạp hết (khử trùng ngoài bằng sort/hash trước) nhanh hơn bao nhiêu bậc so với chèn có chỉ mục? (b) sort ngoài rồi INSERT theo thứ tự khoá có giúp B-tree không? (c) PRAGMA nào (`journal_mode`, `synchronous`, `cache_size`, `temp_store`) tăng tốc mà KHÔNG mất dữ liệu đã commit khi máy tắt đột ngột; (d) có nên chia kho theo băm tiền tố FEN?</w:t>
+      </w:r>
+    </w:p>
+    <w:p>
+      <w:pPr>
+        <w:pStyle w:val="ListNumber"/>
+      </w:pPr>
+      <w:r>
+        <w:t>**Trả lời tốt trông thế nào:** dẫn SQLite docs (pragma, WITHOUT ROWID, bulk insert FAQ), ước lượng thứ tự độ lớn tốc độ (dòng/giây) cho từng cách trên máy tương tự, cảnh báo rõ cách nào mất dữ liệu khi tắt máy giữa chừng, và cách kiểm (COUNT + quick_check) sau nạp.</w:t>
+      </w:r>
+    </w:p>
+    <w:p>
+      <w:r>
+        <w:t>---</w:t>
+      </w:r>
+    </w:p>
+    <w:p>
+      <w:pPr>
+        <w:pStyle w:val="Heading2"/>
+      </w:pPr>
+      <w:r>
+        <w:t>PHẦN Q — Câu hỏi mở từ các lane (gộp 03/10/2026 07:42)</w:t>
+      </w:r>
+    </w:p>
+    <w:p>
+      <w:pPr>
+        <w:pStyle w:val="Heading3"/>
+      </w:pPr>
+      <w:r>
+        <w:t>Từ lane/tệp `fable_t55_t56_meeting_cau_hoi_20261003_0750.md`</w:t>
+      </w:r>
+    </w:p>
+    <w:p>
+      <w:pPr>
+        <w:pStyle w:val="Heading1"/>
+      </w:pPr>
+      <w:r>
+        <w:t>Câu hỏi mở của Fable theo 3 yêu cầu owner 03/10 07:3x–07:5x (lane `fable_netchung_0310`) — gộp vào Ask 01</w:t>
+      </w:r>
+    </w:p>
+    <w:p>
+      <w:pPr>
+        <w:pStyle w:val="Heading3"/>
+      </w:pPr>
+      <w:r>
+        <w:t>NC-05 — Engine lúc đánh: ưu thì THÍ QUÂN để vào hình tàn cuộc đã biết THẮNG, lép thì ép về hình HOÀ hoặc thua chậm nhất — cách làm trong search NNUE là gì?</w:t>
+      </w:r>
+    </w:p>
+    <w:p>
+      <w:pPr>
+        <w:pStyle w:val="ListNumber"/>
+      </w:pPr>
+      <w:r>
+        <w:t>**Bối cảnh:** owner yêu cầu (03/10 07:3x): *«dù lép dù ưu cũng phải đưa về hình tàn lợi thế cho mình; ưu thì cần thí bao nhiêu quân để ra hình tàn có thể thắng dựa trên net của positionendgame đã học; lép thì ráng đưa về hình hoà hoặc bí lâu nhất»*. Đội có kho `positionendgame.fendb` 11.950.107 thế có nhãn wdl/dtm/dtc/nước đúng (ô ≤ 2 quân tấn công giải chính xác; 2v2/3v1 mẫu từ chessdb; `SourceCode/Shared/DataFen/kho_tan_cuoc.py:102-111`), engine nhà có EGTB probe lúc đánh (Nữ Oa cổng egtb 37/0, Bodetosu DTM), eval tàn cuộc hiện yếu (pháo đài −711 cp vs search −8; `AI_Debate/onGoing/CHOT_OWNER_2026-09-12_TOI.md:197`); luật hoà cờ tướng 60/80 ply không ăn quân, nên «thắng lý thuyết» có thể thành hoà theo luật. Phương án đang nghiêng: search lo «đúng số nước» (tách vai search–net), net học trộn có trọng số.</w:t>
+      </w:r>
+    </w:p>
+    <w:p>
+      <w:pPr>
+        <w:pStyle w:val="ListNumber"/>
+      </w:pPr>
+      <w:r>
+        <w:t>**Câu hỏi:** (a) để engine tự nguyện THÍ quân đi vào ô WDL=thắng, chỉ cần probe kho/EGTB ở nút ≤ N quân rồi ghi đè eval bằng điểm mate-theo-dtm là đủ (Stockfish Syzygy-style), hay cần thêm thưởng «đơn giản hoá về hình thắng» khi probe chưa chạm (nhiều quân hơn)? Cách thưởng nào không làm engine thí quân bừa ở trung cuộc? (b) khi lép: chọn nước maximize DTM/DTC (thua chậm nhất) hay maximize «cơ hội đối thủ sai» (swindle); với luật 60/80 ply không ăn quân, cách dùng DTC để ép hoà theo luật là gì? (c) cách KIỂM: bộ thế «ưu một quân, thí một quân ⇒ vào ô thắng đã giải» và «lép, một nước duy nhất vào ô hoà» — đo tỉ lệ chọn đúng theo depth; có bộ thế chuẩn nào của cộng đồng cờ tướng không?</w:t>
+      </w:r>
+    </w:p>
+    <w:p>
+      <w:pPr>
+        <w:pStyle w:val="ListNumber"/>
+      </w:pPr>
+      <w:r>
+        <w:t>**Trả lời tốt trông thế nào:** mô tả cụ thể chỗ cắm trong search (eval/qsearch/root), công thức điểm theo WDL/DTM/DTC và mốc luật, nguồn (Stockfish TB code, Pikafish/Fairy xiangqi EGTB), cảnh báo bẫy (TB cutoff ở nút lặp, điểm mate sai với luật không ăn quân, thí quân bừa), và cách đo A/B không làm yếu trung cuộc.</w:t>
+      </w:r>
+    </w:p>
+    <w:p>
+      <w:pPr>
+        <w:pStyle w:val="Heading3"/>
+      </w:pPr>
+      <w:r>
+        <w:t>NC-06 — Trợ lý AI trong app sinh ảnh/video (ComfyUI_Pro): «nói gì cũng biết làm» — hiểu yêu cầu tự nhiên, đề xuất model, giải thích, rồi tự dựng workflow chạy luôn — kiến trúc nào chạy được OFFLINE trên máy owner?</w:t>
+      </w:r>
+    </w:p>
+    <w:p>
+      <w:pPr>
+        <w:pStyle w:val="ListNumber"/>
+      </w:pPr>
+      <w:r>
+        <w:t>**Bối cảnh:** owner (03/10 07:3x): *«Trong ComfyUI có sẵn 1 AI, tạo triệu tình huống, tôi yêu cầu gì nó phải biết làm, ví dụ làm ảnh nhảy TikTok nó biết, đề xuất model, giải thích và thậm chí làm luôn»*. Đã có: trợ lý theo kho tình huống JSON (`ComfyUIPro/Views/AiView.xaml.cs:56` nạp `TroLyChung.KhoTinhHuong`, gói `scenarios*.json`, mục tiêu ≥ 1.500 tình huống, cổng `--troly-tinhhuong-selftest`), kho model có hash + category (C-408), kho model ngoài `thu_muc_model_ngoai.json` (model ở ổ F), LLM local qua llama-server (Local AI, trần commit 75 %), máy AMD ROCm 47,6 GB RAM, không gọi API trả tiền. ComfyUI chạy workflow JSON qua API nội bộ.</w:t>
+      </w:r>
+    </w:p>
+    <w:p>
+      <w:pPr>
+        <w:pStyle w:val="ListNumber"/>
+      </w:pPr>
+      <w:r>
+        <w:t>**Câu hỏi:** kiến trúc hợp lý cho trợ lý này là gì: RAG trên kho tình huống + catalog model (embedding local) → LLM local sinh «kế hoạch» (model, node, tham số) theo lược đồ JSON có kiểm → dựng workflow từ mẫu đã kiểm → chạy → đọc lỗi ComfyUI và sửa vòng lặp? Nên dùng LLM cỡ nào chạy được trên máy này mà vẫn chọn đúng model/category (so với bảng tra tay)? Làm sao để «triệu tình huống» = tổng quát hoá thật (kiểm bằng tập giữ lại) chứ không phải liệt kê; cách đo độ đúng «đề xuất model» và «làm luôn» (ca theo tên, ca đỏ) ra sao?</w:t>
+      </w:r>
+    </w:p>
+    <w:p>
+      <w:pPr>
+        <w:pStyle w:val="ListNumber"/>
+      </w:pPr>
+      <w:r>
+        <w:t>**Trả lời tốt trông thế nào:** sơ đồ thành phần + định dạng kế hoạch JSON có schema, gợi ý model LLM local cụ thể cho máy ROCm, cách RAG trên JSON tình huống + catalog, vòng lặp sửa lỗi có trần, cách kiểm (bộ 100 yêu cầu tự nhiên giữ lại → đo chọn đúng category/model, thời gian), và bẫy (ảo giác tên model, tham số VRAM, nội dung chặn trẻ em).</w:t>
+      </w:r>
+    </w:p>
+    <w:p>
+      <w:pPr>
+        <w:pStyle w:val="Heading3"/>
+      </w:pPr>
+      <w:r>
+        <w:t>MT-01 — Bạn (AI đang trả lời) có thể THAM GIA «AI Meeting» của chúng tôi bằng cách của bạn không?</w:t>
+      </w:r>
+    </w:p>
+    <w:p>
+      <w:pPr>
+        <w:pStyle w:val="ListNumber"/>
+      </w:pPr>
+      <w:r>
+        <w:t>**Bối cảnh:** đội có app Local AI với tính năng Meeting AI (nhiều AI cùng bàn một câu hỏi, có vai Operator cite code, đăng nhập web do owner tự làm trong WebView2, không lưu mật khẩu — `SourceCode/LocalAI`, cổng `--meeting-selftest` 30/30, `--webtro-selftest` 7/7). Hiện AI ngoài tham gia bằng cách owner copy câu hỏi/đưa file rồi dán trả lời về. Owner (03/10 07:5x): *«yêu cầu AI tham gia AI Meeting bằng cách của họ, không thì mình làm web login»*.</w:t>
+      </w:r>
+    </w:p>
+    <w:p>
+      <w:pPr>
+        <w:pStyle w:val="ListNumber"/>
+      </w:pPr>
+      <w:r>
+        <w:t>**Câu hỏi:** bạn có kênh nào để tham gia trực tiếp một phiên meeting do chúng tôi điều phối — API có khoá (model/endpoint, giới hạn lượt, giá), webhook/polling một repo GitHub công khai (như repo Ask/Answer hiện nay), MCP/connector, hay chỉ qua giao diện web (khi đó chúng tôi sẽ làm web login cho bạn vào)? Hãy nêu đúng cách bạn dùng được, định dạng tin nhắn bạn muốn nhận/trả (markdown, JSON), và ràng buộc (độ dài, tần suất, đăng nhập).</w:t>
+      </w:r>
+    </w:p>
+    <w:p>
+      <w:pPr>
+        <w:pStyle w:val="ListNumber"/>
+      </w:pPr>
+      <w:r>
+        <w:t>**Trả lời tốt trông thế nào:** liệt kê rõ CÓ/KHÔNG cho từng kênh, ví dụ URL/endpoint/định dạng, điều kiện (tài khoản, khoá API, chi phí), và đề xuất quy trình tối thiểu để chúng tôi nối bạn vào trong tuần này.</w:t>
+      </w:r>
+    </w:p>
+    <w:p>
+      <w:r>
+        <w:t>---</w:t>
+      </w:r>
+    </w:p>
+    <w:p>
+      <w:pPr>
+        <w:pStyle w:val="Heading2"/>
+      </w:pPr>
+      <w:r>
+        <w:t>PHẦN Q — Câu hỏi mở từ các lane (gộp 03/10/2026 07:44)</w:t>
+      </w:r>
+    </w:p>
+    <w:p>
+      <w:pPr>
+        <w:pStyle w:val="Heading3"/>
+      </w:pPr>
+      <w:r>
+        <w:t>Từ lane/tệp `fable_dangongu_cau_hoi_20261003_0755.md`</w:t>
+      </w:r>
+    </w:p>
+    <w:p>
+      <w:pPr>
+        <w:pStyle w:val="Heading1"/>
+      </w:pPr>
+      <w:r>
+        <w:t>Câu hỏi bổ sung của Fable theo owner 03/10 07:5x (lane `fable_netchung_0310`) — gộp vào Ask 01</w:t>
+      </w:r>
+    </w:p>
+    <w:p>
+      <w:pPr>
+        <w:pStyle w:val="Heading3"/>
+      </w:pPr>
+      <w:r>
+        <w:t>NC-07 — Trợ lý + mọi ô nhập prompt (text→image / video / music) trong ComfyUI_Pro phải hiểu 10 thứ tiếng (Việt, Anh, Trung, Pháp, Nhật, Hàn, Ý, Đức, Tây Ban Nha, Thái) — làm sao để tool/AI hiểu ĐÚNG vấn đề, chạy offline?</w:t>
+      </w:r>
+    </w:p>
+    <w:p>
+      <w:pPr>
+        <w:pStyle w:val="ListNumber"/>
+      </w:pPr>
+      <w:r>
+        <w:t>**Bối cảnh:** owner (03/10 07:5x): *«ComfyUI khi hỏi kiểu text to image, video, music… và cả hỏi AI đều dùng đa ngôn ngữ (Việt, Anh, Trung, Pháp, Nhật, Hàn, Ý, Đức, Tây Ban Nha, Thái) thì AI hay tool hiểu vấn đề»*. Hiện trợ lý ComfyUI_Pro tra kho tình huống JSON (tiếng Việt/Anh) + sẽ nối LLM local (NC-06); các model sinh ảnh/video/nhạc (SDXL/Flux/Wan/ACE-Step…) chủ yếu hiểu prompt tiếng Anh, một số hiểu tiếng Trung; máy owner AMD ROCm 47,6 GB RAM, không gọi API trả tiền; app đã có nhãn 3–4 ngôn ngữ cho nút (luật đội).</w:t>
+      </w:r>
+    </w:p>
+    <w:p>
+      <w:pPr>
+        <w:pStyle w:val="ListNumber"/>
+      </w:pPr>
+      <w:r>
+        <w:t>**Câu hỏi:** (a) nên nhận diện ngôn ngữ + dịch yêu cầu sang «ngôn ngữ trung gian» (tiếng Anh) trước khi tra kho tình huống/LLM/model, hay dùng thẳng LLM đa ngữ hiểu 10 thứ tiếng rồi sinh prompt tiếng Anh cho model? Model local nào (cỡ ≤ 14B, chạy ROCm) đủ tốt cho cả Thái, Hàn, Nhật, Trung? (b) với prompt sinh ảnh/video/nhạc bằng tiếng Việt/Thái/Hàn…, dịch máy tự động có làm hỏng ý (thành ngữ, tên riêng, phong cách) không, và cách giữ ý (song ngữ: giữ nguyên tên riêng, thêm chú thích)? (c) cách KIỂM: bộ 50 yêu cầu × 10 thứ tiếng (cùng nghĩa) ⇒ trợ lý phải ra CÙNG kế hoạch (category/model/tham số) — ngưỡng đồng nhất bao nhiêu % là đạt; trả lời/giải thích của trợ lý nên bằng ngôn ngữ người hỏi.</w:t>
+      </w:r>
+    </w:p>
+    <w:p>
+      <w:pPr>
+        <w:pStyle w:val="ListNumber"/>
+      </w:pPr>
+      <w:r>
+        <w:t>**Trả lời tốt trông thế nào:** kiến trúc nhận diện ngôn ngữ → dịch/LLM đa ngữ → prompt tiếng Anh cho model, gợi ý model LLM đa ngữ local cụ thể (có nguồn), bẫy dịch máy với prompt nghệ thuật, và bộ kiểm đồng nhất 10 thứ tiếng (ca theo tên, ca đỏ).</w:t>
+      </w:r>
+    </w:p>
+    <w:p>
+      <w:r>
+        <w:t>---</w:t>
+      </w:r>
+    </w:p>
+    <w:p>
+      <w:pPr>
+        <w:pStyle w:val="Heading2"/>
+      </w:pPr>
+      <w:r>
+        <w:t>LUẬT TRẢ LỜI (áp cho MỌI phần A–R)</w:t>
+      </w:r>
+    </w:p>
+    <w:p>
+      <w:pPr>
+        <w:pStyle w:val="ListNumber"/>
+      </w:pPr>
+      <w:r>
         <w:t>🔴 **CẤM BỊA.** Không có nguồn thì nói «không có nguồn / không chắc». Dẫn tệp:dòng không tồn tại, số liệu tự chế, «đã kiểm tra» mà không kiểm — đội sẽ bắt được bằng code (như Phần I) và **AI đó bị hạ độ tin cậy**; bịa làm mất thời gian của owner.</w:t>
       </w:r>
     </w:p>
@@ -17217,7 +18633,7 @@
         <w:pStyle w:val="ListNumber"/>
       </w:pPr>
       <w:r>
-        <w:t>Trả lời theo đúng mã câu (A1-xx, T-xx, I-…, K-x, D-xx, L/M/O/P-xx, GT-B3-xx). Mỗi tệp ≤ 100 KB.</w:t>
+        <w:t>Trả lời theo đúng mã câu (A1-xx, T-xx, I-…, K-x, D-xx, L/M/O/P-xx, GT-B3-xx, D3-xx). Mỗi tệp ≤ 100 KB.</w:t>
       </w:r>
     </w:p>
     <w:p>

</xml_diff>

<commit_message>
Ask 01 03/10 08:1x: +NC-08 (add dan nhan tan cuoc vao net NNUE dang co ma khong quen trung cuoc) => 110 ma cau; link.md cap nhat
</commit_message>
<xml_diff>
--- a/Ask 01/ASK01_TONG_HOP_2026-10-01.docx
+++ b/Ask 01/ASK01_TONG_HOP_2026-10-01.docx
@@ -18605,6 +18605,67 @@
       </w:pPr>
       <w:r>
         <w:t>**Trả lời tốt trông thế nào:** kiến trúc nhận diện ngôn ngữ → dịch/LLM đa ngữ → prompt tiếng Anh cho model, gợi ý model LLM đa ngữ local cụ thể (có nguồn), bẫy dịch máy với prompt nghệ thuật, và bộ kiểm đồng nhất 10 thứ tiếng (ca theo tên, ca đỏ).</w:t>
+      </w:r>
+    </w:p>
+    <w:p>
+      <w:r>
+        <w:t>---</w:t>
+      </w:r>
+    </w:p>
+    <w:p>
+      <w:pPr>
+        <w:pStyle w:val="Heading2"/>
+      </w:pPr>
+      <w:r>
+        <w:t>PHẦN Q — Câu hỏi mở từ các lane (gộp 03/10/2026 07:57)</w:t>
+      </w:r>
+    </w:p>
+    <w:p>
+      <w:pPr>
+        <w:pStyle w:val="Heading3"/>
+      </w:pPr>
+      <w:r>
+        <w:t>Từ lane/tệp `fable_adddan_cau_hoi_20261003_0800.md`</w:t>
+      </w:r>
+    </w:p>
+    <w:p>
+      <w:pPr>
+        <w:pStyle w:val="Heading1"/>
+      </w:pPr>
+      <w:r>
+        <w:t>Câu hỏi bổ sung của Fable theo owner 03/10 08:0x (1b) — gộp vào Ask 01</w:t>
+      </w:r>
+    </w:p>
+    <w:p>
+      <w:pPr>
+        <w:pStyle w:val="Heading3"/>
+      </w:pPr>
+      <w:r>
+        <w:t>NC-08 — «Add dần» nhãn tàn cuộc vào net NNUE ĐANG CÓ (Fairy xiangqi / Pikafish) mà không quên khai cuộc–trung cuộc: fine-tune cách nào khi KHÔNG có dữ liệu train gốc của net đó?</w:t>
+      </w:r>
+    </w:p>
+    <w:p>
+      <w:pPr>
+        <w:pStyle w:val="ListNumber"/>
+      </w:pPr>
+      <w:r>
+        <w:t>**Bối cảnh:** owner (03/10 08:0x): *«engine chưa có net thì nạp thẳng net tàn cuộc rồi build phần ngọn, train phần ngọn; còn OngThan/TruongVoKy/Doccocaubai thì nghiên cứu lấy net NNUE hiện tại rồi add dần vào được không»* · *«4x4 là net mạnh khúc tàn cuộc, khai cuộc trung cuộc còn non, train sau; không gộp được net thì cho net hiện tại rồi train tiếp»*. Đội có round-trip `.bin/.nnue → .pt → train → .bin` cho Fairy (`Docco/trainer_xiangqi/serialize.py`) và Pikafish 2026 (`pikafish2026-nnue-pytorch`, byte-identical); nhãn tàn cuộc 11,9 M thế chính xác (WDL theo luật 80 ply + cp = ±max(1500, 2990 − 10·dtm)); **không có** dữ liệu train gốc của net CC0 `C07E94A5` hay net Pikafish official. Đã đo: fine-tune từ CC0 trên corpus tự sinh (lô N5) ⇒ r 0,79→0,91 nhưng **−301 Elo** [−∞; −147] (nhãn yếu hơn net, WDL toàn 0, kẹp ±2000); ≤ 3v3 chỉ 8,91 % thế ván thật. Phiếu đội nghiêng: trộn 5–15 % tàn cuộc + 3 tập val V1 EGTB / V2 tàn nhiều quân / V3 trung cuộc để đo quên.</w:t>
+      </w:r>
+    </w:p>
+    <w:p>
+      <w:pPr>
+        <w:pStyle w:val="ListNumber"/>
+      </w:pPr>
+      <w:r>
+        <w:t>**Câu hỏi:** (a) khi không có dữ liệu gốc, có nên dùng **tự-distill**: lấy chính net hiện tại chấm một tập thế trung cuộc/khai cuộc (teacher = net cũ) để làm «neo» trộn với nhãn tàn cuộc — tỉ lệ bao nhiêu, bao nhiêu thế, loss nào (cp hay WDL)? (b) nên **đóng băng/giảm LR** tầng feature transformer (HalfKA) và chỉ cho các tầng sau học tàn cuộc, hay cho học toàn mạng với LR nhỏ; lịch LR/epoch gợi ý cho net 11 MB (Fairy L1 512) và 50 MB (Pikafish L1 1024)? (c) với engine chưa có net (train «gốc tàn cuộc trước, ngọn sau»): làm sao để lúc train «ngọn» (trung cuộc) không xoá kiến thức tàn cuộc — replay bao nhiêu %, kiểm bằng V1 thế nào; có kinh nghiệm EGTB-rescoring/curriculum nào trong Stockfish/Fairy/Pikafish đáng theo? (d) ngưỡng chấp nhận: A/B nodes cố định phải ≥ 0 Elo ở trung cuộc (V3) và cải thiện đo được ở tàn cuộc (ρ(net, WDL) trên ô giữ lại) — ngưỡng cụ thể nên đặt trước là gì?</w:t>
+      </w:r>
+    </w:p>
+    <w:p>
+      <w:pPr>
+        <w:pStyle w:val="ListNumber"/>
+      </w:pPr>
+      <w:r>
+        <w:t>**Trả lời tốt trông thế nào:** công thức trộn/replay có nguồn (continual learning, knowledge distillation, nnue-pytorch fine-tune practice), lịch LR/epoch cụ thể cho 2 cỡ net, cách đo quên bằng 3 tập val, và cảnh báo bẫy (lượng tử int8 1/64 nuốt thay đổi nhỏ; nhãn cp vs WDL lệch thang; net official = phái sinh không bán được).</w:t>
       </w:r>
     </w:p>
     <w:p>

</xml_diff>

<commit_message>
Ask 01 03/10 10:0x: chot truoc khi owner di hoi (gom staging con lai + link.md)
</commit_message>
<xml_diff>
--- a/Ask 01/ASK01_TONG_HOP_2026-10-01.docx
+++ b/Ask 01/ASK01_TONG_HOP_2026-10-01.docx
@@ -18666,6 +18666,136 @@
       </w:pPr>
       <w:r>
         <w:t>**Trả lời tốt trông thế nào:** công thức trộn/replay có nguồn (continual learning, knowledge distillation, nnue-pytorch fine-tune practice), lịch LR/epoch cụ thể cho 2 cỡ net, cách đo quên bằng 3 tập val, và cảnh báo bẫy (lượng tử int8 1/64 nuốt thay đổi nhỏ; nhãn cp vs WDL lệch thang; net official = phái sinh không bán được).</w:t>
+      </w:r>
+    </w:p>
+    <w:p>
+      <w:r>
+        <w:t>---</w:t>
+      </w:r>
+    </w:p>
+    <w:p>
+      <w:pPr>
+        <w:pStyle w:val="Heading2"/>
+      </w:pPr>
+      <w:r>
+        <w:t>PHẦN Q — Câu hỏi mở từ các lane (gộp 03/10/2026 10:04)</w:t>
+      </w:r>
+    </w:p>
+    <w:p>
+      <w:pPr>
+        <w:pStyle w:val="Heading3"/>
+      </w:pPr>
+      <w:r>
+        <w:t>Từ lane/tệp `Sonnet_cau_hoi_20261003_0910.md`</w:t>
+      </w:r>
+    </w:p>
+    <w:p>
+      <w:pPr>
+        <w:pStyle w:val="Heading1"/>
+      </w:pPr>
+      <w:r>
+        <w:t>Sonnet — câu hỏi thả vào Ask 01 (03/10/2026 09:10 giờ máy)</w:t>
+      </w:r>
+    </w:p>
+    <w:p>
+      <w:r>
+        <w:t>Nguồn: đợt soi chéo sáng 03/10 của lane Sonnet (phiếu `AI_Debate/onGoing/SOI_CHEO_3AI_2026-10-03.md` §3). Cả ba câu đều đã đo bằng máy trên cây thật/bản chép (số trong từng câu là số đo, không phải ước lượng) và chưa có đáp án nội bộ chắc chắn; theo luật owner 02/10 13:2x lane code không chờ Answer — cần Answer để sửa nếu mặc định hiện tại sai.</w:t>
+      </w:r>
+    </w:p>
+    <w:p>
+      <w:pPr>
+        <w:pStyle w:val="Heading3"/>
+      </w:pPr>
+      <w:r>
+        <w:t>SON-01 — Nhãn thầy khi sinh dữ liệu distill: xoá bảng băm mỗi thế (`ucinewgame`) hay giữ ấm giữa các thế?</w:t>
+      </w:r>
+    </w:p>
+    <w:p>
+      <w:pPr>
+        <w:pStyle w:val="ListBullet"/>
+      </w:pPr>
+      <w:r>
+        <w:t>**Bối cảnh:** đội sinh nhãn thầy cho distill NNUE cờ tướng bằng engine Docco (họ Fairy-Stockfish, net CC0), `depth/nodes` cố định, Threads 1, tắt book/learn: mỗi thế gửi `position fen …` + `go` rồi ghi `score_cp` + bestmove (`SourceCode/OngThan_variants/Docco/gen_thay_that.py`, hàm `Thay.hoi()`; `ucinewgame` chỉ gửi ở cổng mate `:698`, KHÔNG gửi giữa các thế ⇒ bảng băm giữ nguyên từ thế trước). Đo thật (Docco `B3BC0995…`, 40 thế đầu `the_chon.epd`, Threads 1): cùng thứ tự 2 lần ⇒ nhãn trùng byte (sha `39E0D7B2…`); **ĐẢO thứ tự ⇒ 37/40 thế đổi `score_cp`, 14/40 đổi bestmove, số thế mate nhận ra đổi 2→1**; thêm `ucinewgame` trước mỗi thế ⇒ đảo thứ tự **0/40** đổi (A=A sha `9BAC7ED2…`), thời gian cùng cỡ (13–15 s/40 thế). Bằng chứng `LaneScratch/sonnet_soi_0310/X1_data/C3_docco_thutu_out.txt` + `C5_docco_G11_out.txt`. Lô thật đầu tiên (10.283 nhãn) đã sinh theo kiểu cũ (không `ucinewgame`). **Một đo độc lập khác trong đội** (Opus T-54, `SourceCode/Shared/DataFen/nhan_engine_tancuoc.py:49-55,286-290`, Docco CC0 Threads 1, nhãn tàn cuộc có đáp án chính xác từ bộ giải lùi): bảng băm mang từ thế trước làm nhãn KHÔNG tái lập (cùng mẫu 1.000 thế, `--giay 1`: lượt 1 d16/d20 KHÔNG ĐẠT vì 1 «mate giả» mỗi độ sâu, lượt 2 cùng mẫu ĐẠT); thêm `ucinewgame` mỗi thế ⇒ 2 lượt 300 thế cho số đếm GIỐNG HỆT, nhưng độ phủ nhãn ở d16 tụt **90,7 % → 66 %** (bảng băm cũ từng giúp thấy mate) — tức tái lập đổi bằng sức tìm; hiện hai đường sinh nhãn của đội xử khác nhau (NCB-03 / `gen_thay_that.hoi()` không `ucinewgame`; T-54 có).</w:t>
+      </w:r>
+    </w:p>
+    <w:p>
+      <w:pPr>
+        <w:pStyle w:val="ListBullet"/>
+      </w:pPr>
+      <w:r>
+        <w:t>**Câu hỏi:** khi sinh nhãn để huấn luyện/distill NNUE (10⁴–10⁶ thế), nên **xoá bảng băm mỗi thế** (nhãn là hàm thuần của thế, tái lập được, nhưng mỗi lần tìm bắt đầu nguội) hay **giữ TT ấm** giữa các thế liên tiếp (tìm sâu hơn thực chất, nhưng nhãn phụ thuộc thứ tự/đường đi, không tái lập khi chia mảnh khác)? Các bộ sinh dữ liệu đang dùng thực tế (Stockfish `gensfen`/`generate_training_data`, bộ sinh của Pikafish/Fairy, lc0…) làm gì ở điểm này, và có số đo nào về ảnh hưởng tới chất lượng net học trò?</w:t>
+      </w:r>
+    </w:p>
+    <w:p>
+      <w:pPr>
+        <w:pStyle w:val="ListBullet"/>
+      </w:pPr>
+      <w:r>
+        <w:t>**Trả lời tốt trông thế nào:** nêu hành vi của ít nhất 2 bộ sinh dữ liệu thật (kèm tên tệp/cờ/tham số hoặc link mã); có hoặc không có số ablation (Elo hoặc loss) cho 2 chế độ — nếu chỉ lập luận thì ghi rõ «không có số», khuyến nghị MỘT chế độ + điều kiện để đổi ý. «Không chắc» chấp nhận được.</w:t>
+      </w:r>
+    </w:p>
+    <w:p>
+      <w:pPr>
+        <w:pStyle w:val="Heading3"/>
+      </w:pPr>
+      <w:r>
+        <w:t>SON-02 — Đo hai net bằng engine TẤT ĐỊNH: cần bao nhiêu thế mở đầu/bao nhiêu ván và dừng thế nào?</w:t>
+      </w:r>
+    </w:p>
+    <w:p>
+      <w:pPr>
+        <w:pStyle w:val="ListBullet"/>
+      </w:pPr>
+      <w:r>
+        <w:t>**Bối cảnh:** rig `ab_net.py` (`_LANE_NOTE/_scratch_code_luu/w_net_ab_0210/ab_net.py`) đánh hai net cùng một engine (mỗi net một thư mục riêng), config thi đấu, `nodes` cố định (50k–100k), Threads 1, ponder tắt, NoBook; thế mở đầu = thế yên lấy từ kho FEN, mỗi thế đánh 2 ván đổi màu. Engine **tất định** ⇒ A=A luôn ra thắng-thua cân (Docco n=12: +4 =4 −4, Elo 0, KTC95 [−108; +108]; Bodetosu +2 =8 −2); đối chứng dương (nodes ×4) n=16: +12 =4 −0, Elo +338 [+176; +∞). Độ rộng KTC ~1/√n: n=12 ⇒ ±108 Elo, n=70 ⇒ ≈ ±45, n=300 ⇒ ≈ ±22; chi phí ≈ 1 phút/ván ở 50k nodes ⇒ 300 ván ≈ 5 giờ tuần tự. Tỉ lệ hoà quan sát: 4/12 (33 %).</w:t>
+      </w:r>
+    </w:p>
+    <w:p>
+      <w:pPr>
+        <w:pStyle w:val="ListBullet"/>
+      </w:pPr>
+      <w:r>
+        <w:t>**Câu hỏi:** để chọn net tốt hơn trong các cặp chênh thật khoảng +20…+50 Elo với engine tất định, **thiết kế rẻ nhất mà vẫn hợp lệ** là gì — số **thế mở đầu khác nhau** cần có (cặp đổi màu), số ván, và **luật dừng** (SPRT/GSPRT pentanomial kiểu fishtest, giới hạn [0, +10] Elo, α = β = 0,05)? Cùng một thế mở đầu đánh lại có vô ích không (tất định ⇒ ván lặp), và nên đa dạng hoá bằng gì (nước ngẫu nhiên 4–8 ply, `Hash` khác nhau…) mà không làm méo phép đo?</w:t>
+      </w:r>
+    </w:p>
+    <w:p>
+      <w:pPr>
+        <w:pStyle w:val="ListBullet"/>
+      </w:pPr>
+      <w:r>
+        <w:t>**Trả lời tốt trông thế nào:** số ván kỳ vọng (trung vị) để đạt công suất 80–95 % cho +20/+30/+50 Elo ở tỉ lệ hoà 35–60 %, kèm công thức hoặc công cụ (fishtest LLR pentanomial, OpenBench, `cutechess-cli -sprt`) và cách tránh ván trùng khi engine tất định.</w:t>
+      </w:r>
+    </w:p>
+    <w:p>
+      <w:pPr>
+        <w:pStyle w:val="Heading3"/>
+      </w:pPr>
+      <w:r>
+        <w:t>SON-03 — Bộ đọc bàn bằng YOLO: khoá lưới một lần rồi dùng lại thì sai khi cửa sổ app dời — chính sách giữ lưới ổn định nên là gì?</w:t>
+      </w:r>
+    </w:p>
+    <w:p>
+      <w:pPr>
+        <w:pStyle w:val="ListBullet"/>
+      </w:pPr>
+      <w:r>
+        <w:t>**Bối cảnh:** `SourceCode/_Shared_xqcore/reading/yolo.py:218-223,276-293` khoá lưới (X0, Y0, ô) một lần từ khung đủ quân (khai cuộc ≥ MIN_QUAN) rồi dùng lại mọi khung sau, không kiểm trôi. Dựng lại bằng bộ quân giả (`LaneScratch/sonnet_soi_0310/X3_core/probe_A.py`, ô = 50 px; Sonnet tự chạy lại 03/10): khoá từ khai cuộc 32 quân rồi dời toạ độ phát hiện — dx = 10 và 24 px ĐÚNG; **dx = 26 px (≈ nửa ô) ⇒ `ok=True` nhưng bàn SAI** (còn 30 quân, `validate_board` vẫn True); (37, 11) và 50 px cũng sai; 100 px sai nhưng `validate_board` False; đối chứng «suy lưới lại từ quân mỗi khung» ĐÚNG ở (37, 11). Hệ quả: `vision_trainer.collect_loop` (lấy `reader.last_geometry` rồi lưu khung) có thể ghi ảnh với nhãn sai vào dataset.</w:t>
+      </w:r>
+    </w:p>
+    <w:p>
+      <w:pPr>
+        <w:pStyle w:val="ListBullet"/>
+      </w:pPr>
+      <w:r>
+        <w:t>**Câu hỏi:** với bot đọc bàn cờ tướng từ ảnh màn hình (cửa sổ app có thể bị dời/đổi cỡ giữa ván; lưới 9×10; quân đôi khi bị che, bàn gần rỗng ở tàn cuộc, có cờ úp), **chính sách giữ lưới ổn định** nên là: (a) khoá + kiểm trôi mỗi khung (khoảng cách tâm quân phát hiện tới nút lưới; vượt ngưỡng ⇒ bỏ khoá + suy lại hoặc trả `ok=False`), (b) luôn khớp lưới theo quân mỗi khung (RANSAC/bình phương tối thiểu, ràng buộc ô vuông, bước ô ổn định), hay (c) dùng đường kẻ bàn (Hough/góc bàn) làm neo? Ngưỡng thực dụng là bao nhiêu (tính theo phần của ô) và chế độ hỏng nào hay gặp?</w:t>
+      </w:r>
+    </w:p>
+    <w:p>
+      <w:pPr>
+        <w:pStyle w:val="ListBullet"/>
+      </w:pPr>
+      <w:r>
+        <w:t>**Trả lời tốt trông thế nào:** thuật toán + ngưỡng cụ thể (đơn vị: phần của ô) + ví dụ mã nguồn mở đang làm việc này (tên repo/tệp), kèm ca thử để kiểm (khoá rồi dời 26 px ⇒ phải KHÔNG ra `ok=True` với bàn sai).</w:t>
       </w:r>
     </w:p>
     <w:p>

</xml_diff>